<commit_message>
Add figure numbers to decision_maker_report.md's chart captions
Three embedded charts had captions but no "Figure N" label, unlike
technical_report.md's consistent numbering. Regenerated exports.

Co-Authored-By: Claude Sonnet 5 <noreply@anthropic.com>
Claude-Session: https://claude.ai/code/session_018QWUZKRLeoWxGNHR3MjKJP
</commit_message>
<xml_diff>
--- a/reports/exports/decision_maker_report.docx
+++ b/reports/exports/decision_maker_report.docx
@@ -340,7 +340,7 @@
           <w:iCs/>
           <w:i/>
         </w:rPr>
-        <w:t xml:space="preserve">The system’s cost per kilowatt-hour as battery size increases. The lowest-cost point (19 battery modules, 4,750 kWh) sits in the middle — not at zero battery, and not at the largest battery tested.</w:t>
+        <w:t xml:space="preserve">Figure 1 — The system’s cost per kilowatt-hour as battery size increases. The lowest-cost point (19 battery modules, 4,750 kWh) sits in the middle — not at zero battery, and not at the largest battery tested.</w:t>
       </w:r>
     </w:p>
     <w:bookmarkEnd w:id="23"/>
@@ -773,7 +773,7 @@
           <w:iCs/>
           <w:i/>
         </w:rPr>
-        <w:t xml:space="preserve">Extra cost incurred, per model, from following its battery-size recommendation instead of the true optimum — after training on 5,000 example projects. Lower is better. The AI (neural network) and Random Forest are statistically tied for cheapest to trust.</w:t>
+        <w:t xml:space="preserve">Figure 2 — Extra cost incurred, per model, from following its battery-size recommendation instead of the true optimum — after training on 5,000 example projects. Lower is better. The AI (neural network) and Random Forest are statistically tied for cheapest to trust.</w:t>
       </w:r>
     </w:p>
     <w:p>
@@ -1216,7 +1216,7 @@
           <w:iCs/>
           <w:i/>
         </w:rPr>
-        <w:t xml:space="preserve">Time required per evaluation, from slowest (full mechanistic simulation) to fastest (AI inference) — note the scale is logarithmic, so each step down is roughly a 10x-1000x speed difference.</w:t>
+        <w:t xml:space="preserve">Figure 3 — Time required per evaluation, from slowest (full mechanistic simulation) to fastest (AI inference) — note the scale is logarithmic, so each step down is roughly a 10x-1000x speed difference.</w:t>
       </w:r>
     </w:p>
     <w:bookmarkEnd w:id="33"/>

</xml_diff>

<commit_message>
Add inline figure citations throughout both reports
Every embedded figure previously only had a caption below/above it --
the surrounding prose never said "(Figure N)" to connect the narrative
to the image, so a reader following the text alone had no cue to look
at a specific chart at a specific point. Added explicit inline citations
for all 21 figure groups in technical_report.md and all 3 in
decision_maker_report.md, verified programmatically (every figure
number now appears at least twice: once in its caption, once in the
prose that discusses it). Regenerated exports.

Co-Authored-By: Claude Sonnet 5 <noreply@anthropic.com>
Claude-Session: https://claude.ai/code/session_018QWUZKRLeoWxGNHR3MjKJP
</commit_message>
<xml_diff>
--- a/reports/exports/decision_maker_report.docx
+++ b/reports/exports/decision_maker_report.docx
@@ -196,13 +196,13 @@
         <w:t xml:space="preserve"> </w:t>
       </w:r>
       <w:r>
-        <w:t xml:space="preserve">For this project’s baseline case, the cost of electricity produced by the</w:t>
-      </w:r>
-      <w:r>
-        <w:t xml:space="preserve"> </w:t>
-      </w:r>
-      <w:r>
-        <w:t xml:space="preserve">system (measured in Euros per kilowatt-hour, or</w:t>
+        <w:t xml:space="preserve">Figure 1 shows this directly: for this project’s baseline case, the cost of</w:t>
+      </w:r>
+      <w:r>
+        <w:t xml:space="preserve"> </w:t>
+      </w:r>
+      <w:r>
+        <w:t xml:space="preserve">electricity produced by the system (measured in Euros per kilowatt-hour, or</w:t>
       </w:r>
       <w:r>
         <w:t xml:space="preserve"> </w:t>
@@ -211,7 +211,13 @@
         <w:t xml:space="preserve">“</w:t>
       </w:r>
       <w:r>
-        <w:t xml:space="preserve">system LCOE</w:t>
+        <w:t xml:space="preserve">system</w:t>
+      </w:r>
+      <w:r>
+        <w:t xml:space="preserve"> </w:t>
+      </w:r>
+      <w:r>
+        <w:t xml:space="preserve">LCOE</w:t>
       </w:r>
       <w:r>
         <w:t xml:space="preserve">”</w:t>
@@ -220,23 +226,31 @@
         <w:t xml:space="preserve"> </w:t>
       </w:r>
       <w:r>
-        <w:t xml:space="preserve">— Levelized Cost Of</w:t>
-      </w:r>
-      <w:r>
-        <w:t xml:space="preserve"> </w:t>
-      </w:r>
-      <w:r>
-        <w:t xml:space="preserve">Energy) starts at</w:t>
-      </w:r>
-      <w:r>
-        <w:t xml:space="preserve"> </w:t>
-      </w:r>
-      <w:r>
-        <w:rPr>
-          <w:bCs/>
-          <w:b/>
-        </w:rPr>
-        <w:t xml:space="preserve">0.287 EUR/kWh with no battery at all</w:t>
+        <w:t xml:space="preserve">— Levelized Cost Of Energy) starts at</w:t>
+      </w:r>
+      <w:r>
+        <w:t xml:space="preserve"> </w:t>
+      </w:r>
+      <w:r>
+        <w:rPr>
+          <w:bCs/>
+          <w:b/>
+        </w:rPr>
+        <w:t xml:space="preserve">0.287 EUR/kWh with no battery at</w:t>
+      </w:r>
+      <w:r>
+        <w:rPr>
+          <w:bCs/>
+          <w:b/>
+        </w:rPr>
+        <w:t xml:space="preserve"> </w:t>
+      </w:r>
+      <w:r>
+        <w:rPr>
+          <w:bCs/>
+          <w:b/>
+        </w:rPr>
+        <w:t xml:space="preserve">all</w:t>
       </w:r>
       <w:r>
         <w:t xml:space="preserve">, falls to a low of</w:t>
@@ -271,19 +285,19 @@
         <w:t xml:space="preserve"> </w:t>
       </w:r>
       <w:r>
-        <w:t xml:space="preserve">if</w:t>
-      </w:r>
-      <w:r>
-        <w:t xml:space="preserve"> </w:t>
-      </w:r>
-      <w:r>
-        <w:t xml:space="preserve">more battery is added beyond that point. Getting the size right is worth real money;</w:t>
-      </w:r>
-      <w:r>
-        <w:t xml:space="preserve"> </w:t>
-      </w:r>
-      <w:r>
-        <w:t xml:space="preserve">getting it wrong in either direction costs more than it needs to.</w:t>
+        <w:t xml:space="preserve">if more battery is added beyond that point. Getting the</w:t>
+      </w:r>
+      <w:r>
+        <w:t xml:space="preserve"> </w:t>
+      </w:r>
+      <w:r>
+        <w:t xml:space="preserve">size right is worth real money; getting it wrong in either direction costs more than</w:t>
+      </w:r>
+      <w:r>
+        <w:t xml:space="preserve"> </w:t>
+      </w:r>
+      <w:r>
+        <w:t xml:space="preserve">it needs to.</w:t>
       </w:r>
     </w:p>
     <w:p>
@@ -716,7 +730,13 @@
         <w:t xml:space="preserve"> </w:t>
       </w:r>
       <w:r>
-        <w:t xml:space="preserve">Random Forest) also tested in this study.</w:t>
+        <w:t xml:space="preserve">Random Forest) also tested in this study. Figure 2 shows this well-trained</w:t>
+      </w:r>
+      <w:r>
+        <w:t xml:space="preserve"> </w:t>
+      </w:r>
+      <w:r>
+        <w:t xml:space="preserve">comparison across all methods tested.</w:t>
       </w:r>
     </w:p>
     <w:p>
@@ -1037,31 +1057,37 @@
         <w:pStyle w:val="FirstParagraph"/>
       </w:pPr>
       <w:r>
-        <w:t xml:space="preserve">AI inference is dramatically faster than the full simulation — a single prediction</w:t>
-      </w:r>
-      <w:r>
-        <w:t xml:space="preserve"> </w:t>
-      </w:r>
-      <w:r>
-        <w:t xml:space="preserve">takes a fraction of a millisecond, versus roughly a tenth to a third of a second for</w:t>
-      </w:r>
-      <w:r>
-        <w:t xml:space="preserve"> </w:t>
-      </w:r>
-      <w:r>
-        <w:t xml:space="preserve">the full simulation. But training an AI model itself takes time and requires</w:t>
-      </w:r>
-      <w:r>
-        <w:t xml:space="preserve"> </w:t>
-      </w:r>
-      <w:r>
-        <w:t xml:space="preserve">generating training examples with the (slower) mechanistic method first. This means</w:t>
-      </w:r>
-      <w:r>
-        <w:t xml:space="preserve"> </w:t>
-      </w:r>
-      <w:r>
-        <w:t xml:space="preserve">AI only pays off once it is used enough times to recoup that upfront cost.</w:t>
+        <w:t xml:space="preserve">AI inference is dramatically faster than the full simulation (Figure 3) — a single</w:t>
+      </w:r>
+      <w:r>
+        <w:t xml:space="preserve"> </w:t>
+      </w:r>
+      <w:r>
+        <w:t xml:space="preserve">prediction takes a fraction of a millisecond, versus roughly a tenth to a third of a</w:t>
+      </w:r>
+      <w:r>
+        <w:t xml:space="preserve"> </w:t>
+      </w:r>
+      <w:r>
+        <w:t xml:space="preserve">second for the full simulation. But training an AI model itself takes time and</w:t>
+      </w:r>
+      <w:r>
+        <w:t xml:space="preserve"> </w:t>
+      </w:r>
+      <w:r>
+        <w:t xml:space="preserve">requires generating training examples with the (slower) mechanistic method first.</w:t>
+      </w:r>
+      <w:r>
+        <w:t xml:space="preserve"> </w:t>
+      </w:r>
+      <w:r>
+        <w:t xml:space="preserve">This means AI only pays off once it is used enough times to recoup that upfront</w:t>
+      </w:r>
+      <w:r>
+        <w:t xml:space="preserve"> </w:t>
+      </w:r>
+      <w:r>
+        <w:t xml:space="preserve">cost.</w:t>
       </w:r>
     </w:p>
     <w:p>

</xml_diff>

<commit_message>
Remove markdown bold formatting from both reports
Heavy **bold** emphasis throughout technical_report.md and
decision_maker_report.md rendered as visually noisy highlighted text in
the PDF/Word exports. Stripped all bold markers while preserving content,
structure, and figure citations; regenerated exports.
</commit_message>
<xml_diff>
--- a/reports/exports/decision_maker_report.docx
+++ b/reports/exports/decision_maker_report.docx
@@ -16,17 +16,7 @@
         <w:pStyle w:val="FirstParagraph"/>
       </w:pPr>
       <w:r>
-        <w:rPr>
-          <w:bCs/>
-          <w:b/>
-        </w:rPr>
-        <w:t xml:space="preserve">What this document is:</w:t>
-      </w:r>
-      <w:r>
-        <w:t xml:space="preserve"> </w:t>
-      </w:r>
-      <w:r>
-        <w:t xml:space="preserve">a plain-language summary of a technical study comparing</w:t>
+        <w:t xml:space="preserve">What this document is: a plain-language summary of a technical study comparing</w:t>
       </w:r>
       <w:r>
         <w:t xml:space="preserve"> </w:t>
@@ -88,17 +78,7 @@
         <w:pStyle w:val="BodyText"/>
       </w:pPr>
       <w:r>
-        <w:rPr>
-          <w:bCs/>
-          <w:b/>
-        </w:rPr>
-        <w:t xml:space="preserve">Study site:</w:t>
-      </w:r>
-      <w:r>
-        <w:t xml:space="preserve"> </w:t>
-      </w:r>
-      <w:r>
-        <w:t xml:space="preserve">an industrial facility in Jinan, China, with 1,800 kW of solar panels,</w:t>
+        <w:t xml:space="preserve">Study site: an industrial facility in Jinan, China, with 1,800 kW of solar panels,</w:t>
       </w:r>
       <w:r>
         <w:t xml:space="preserve"> </w:t>
@@ -226,78 +206,25 @@
         <w:t xml:space="preserve"> </w:t>
       </w:r>
       <w:r>
-        <w:t xml:space="preserve">— Levelized Cost Of Energy) starts at</w:t>
-      </w:r>
-      <w:r>
-        <w:t xml:space="preserve"> </w:t>
-      </w:r>
-      <w:r>
-        <w:rPr>
-          <w:bCs/>
-          <w:b/>
-        </w:rPr>
-        <w:t xml:space="preserve">0.287 EUR/kWh with no battery at</w:t>
-      </w:r>
-      <w:r>
-        <w:rPr>
-          <w:bCs/>
-          <w:b/>
-        </w:rPr>
-        <w:t xml:space="preserve"> </w:t>
-      </w:r>
-      <w:r>
-        <w:rPr>
-          <w:bCs/>
-          <w:b/>
-        </w:rPr>
-        <w:t xml:space="preserve">all</w:t>
-      </w:r>
-      <w:r>
-        <w:t xml:space="preserve">, falls to a low of</w:t>
-      </w:r>
-      <w:r>
-        <w:t xml:space="preserve"> </w:t>
-      </w:r>
-      <w:r>
-        <w:rPr>
-          <w:bCs/>
-          <w:b/>
-        </w:rPr>
-        <w:t xml:space="preserve">0.239 EUR/kWh</w:t>
-      </w:r>
-      <w:r>
-        <w:t xml:space="preserve"> </w:t>
-      </w:r>
-      <w:r>
-        <w:t xml:space="preserve">at a specific battery size, and then</w:t>
-      </w:r>
-      <w:r>
-        <w:t xml:space="preserve"> </w:t>
-      </w:r>
-      <w:r>
-        <w:rPr>
-          <w:bCs/>
-          <w:b/>
-        </w:rPr>
-        <w:t xml:space="preserve">climbs back up again</w:t>
-      </w:r>
-      <w:r>
-        <w:t xml:space="preserve"> </w:t>
-      </w:r>
-      <w:r>
-        <w:t xml:space="preserve">if more battery is added beyond that point. Getting the</w:t>
-      </w:r>
-      <w:r>
-        <w:t xml:space="preserve"> </w:t>
-      </w:r>
-      <w:r>
-        <w:t xml:space="preserve">size right is worth real money; getting it wrong in either direction costs more than</w:t>
-      </w:r>
-      <w:r>
-        <w:t xml:space="preserve"> </w:t>
-      </w:r>
-      <w:r>
-        <w:t xml:space="preserve">it needs to.</w:t>
+        <w:t xml:space="preserve">— Levelized Cost Of Energy) starts at 0.287 EUR/kWh with no battery at all,</w:t>
+      </w:r>
+      <w:r>
+        <w:t xml:space="preserve"> </w:t>
+      </w:r>
+      <w:r>
+        <w:t xml:space="preserve">falls to a low of 0.239 EUR/kWh at a specific battery size, and then climbs back up</w:t>
+      </w:r>
+      <w:r>
+        <w:t xml:space="preserve"> </w:t>
+      </w:r>
+      <w:r>
+        <w:t xml:space="preserve">again if more battery is added beyond that point. Getting the size right is worth</w:t>
+      </w:r>
+      <w:r>
+        <w:t xml:space="preserve"> </w:t>
+      </w:r>
+      <w:r>
+        <w:t xml:space="preserve">real money; getting it wrong in either direction costs more than it needs to.</w:t>
       </w:r>
     </w:p>
     <w:p>
@@ -372,71 +299,61 @@
         <w:pStyle w:val="FirstParagraph"/>
       </w:pPr>
       <w:r>
-        <w:rPr>
-          <w:bCs/>
-          <w:b/>
-        </w:rPr>
-        <w:t xml:space="preserve">Method 1 — Mechanistic simulation</w:t>
-      </w:r>
-      <w:r>
-        <w:t xml:space="preserve"> </w:t>
-      </w:r>
-      <w:r>
-        <w:t xml:space="preserve">works like a very thorough engineering</w:t>
-      </w:r>
-      <w:r>
-        <w:t xml:space="preserve"> </w:t>
-      </w:r>
-      <w:r>
-        <w:t xml:space="preserve">calculation: for every possible battery size (this study tested 81 sizes, from none</w:t>
-      </w:r>
-      <w:r>
-        <w:t xml:space="preserve"> </w:t>
-      </w:r>
-      <w:r>
-        <w:t xml:space="preserve">up to 20,000 kWh), it simulates every single hour of a full year — how much solar and</w:t>
-      </w:r>
-      <w:r>
-        <w:t xml:space="preserve"> </w:t>
-      </w:r>
-      <w:r>
-        <w:t xml:space="preserve">wind power was generated, how much the battery charged and discharged, how much</w:t>
-      </w:r>
-      <w:r>
-        <w:t xml:space="preserve"> </w:t>
-      </w:r>
-      <w:r>
-        <w:t xml:space="preserve">diesel fuel was burned to cover the rest — and calculates the total cost. It then</w:t>
-      </w:r>
-      <w:r>
-        <w:t xml:space="preserve"> </w:t>
-      </w:r>
-      <w:r>
-        <w:t xml:space="preserve">picks whichever size gives the lowest cost. This is exhaustive, transparent, and</w:t>
-      </w:r>
-      <w:r>
-        <w:t xml:space="preserve"> </w:t>
-      </w:r>
-      <w:r>
-        <w:t xml:space="preserve">trustworthy, but each full calculation for one system configuration takes a fraction</w:t>
-      </w:r>
-      <w:r>
-        <w:t xml:space="preserve"> </w:t>
-      </w:r>
-      <w:r>
-        <w:t xml:space="preserve">of a second on modern hardware — it only becomes slow when it has to be repeated</w:t>
-      </w:r>
-      <w:r>
-        <w:t xml:space="preserve"> </w:t>
-      </w:r>
-      <w:r>
-        <w:t xml:space="preserve">thousands of times for many different possible projects (different locations, load</w:t>
-      </w:r>
-      <w:r>
-        <w:t xml:space="preserve"> </w:t>
-      </w:r>
-      <w:r>
-        <w:t xml:space="preserve">sizes, equipment mixes).</w:t>
+        <w:t xml:space="preserve">Method 1, mechanistic simulation, works like a very thorough engineering calculation:</w:t>
+      </w:r>
+      <w:r>
+        <w:t xml:space="preserve"> </w:t>
+      </w:r>
+      <w:r>
+        <w:t xml:space="preserve">for every possible battery size (this study tested 81 sizes, from none up to 20,000</w:t>
+      </w:r>
+      <w:r>
+        <w:t xml:space="preserve"> </w:t>
+      </w:r>
+      <w:r>
+        <w:t xml:space="preserve">kWh), it simulates every single hour of a full year — how much solar and wind power</w:t>
+      </w:r>
+      <w:r>
+        <w:t xml:space="preserve"> </w:t>
+      </w:r>
+      <w:r>
+        <w:t xml:space="preserve">was generated, how much the battery charged and discharged, how much diesel fuel was</w:t>
+      </w:r>
+      <w:r>
+        <w:t xml:space="preserve"> </w:t>
+      </w:r>
+      <w:r>
+        <w:t xml:space="preserve">burned to cover the rest — and calculates the total cost. It then picks whichever</w:t>
+      </w:r>
+      <w:r>
+        <w:t xml:space="preserve"> </w:t>
+      </w:r>
+      <w:r>
+        <w:t xml:space="preserve">size gives the lowest cost. This is exhaustive, transparent, and trustworthy, but</w:t>
+      </w:r>
+      <w:r>
+        <w:t xml:space="preserve"> </w:t>
+      </w:r>
+      <w:r>
+        <w:t xml:space="preserve">each full calculation for one system configuration takes a fraction of a second on</w:t>
+      </w:r>
+      <w:r>
+        <w:t xml:space="preserve"> </w:t>
+      </w:r>
+      <w:r>
+        <w:t xml:space="preserve">modern hardware — it only becomes slow when it has to be repeated thousands of times</w:t>
+      </w:r>
+      <w:r>
+        <w:t xml:space="preserve"> </w:t>
+      </w:r>
+      <w:r>
+        <w:t xml:space="preserve">for many different possible projects (different locations, load sizes, equipment</w:t>
+      </w:r>
+      <w:r>
+        <w:t xml:space="preserve"> </w:t>
+      </w:r>
+      <w:r>
+        <w:t xml:space="preserve">mixes).</w:t>
       </w:r>
     </w:p>
     <w:p>
@@ -444,17 +361,7 @@
         <w:pStyle w:val="BodyText"/>
       </w:pPr>
       <w:r>
-        <w:rPr>
-          <w:bCs/>
-          <w:b/>
-        </w:rPr>
-        <w:t xml:space="preserve">Method 2 — AI (a trained neural network)</w:t>
-      </w:r>
-      <w:r>
-        <w:t xml:space="preserve"> </w:t>
-      </w:r>
-      <w:r>
-        <w:t xml:space="preserve">is a model trained to predict the answer</w:t>
+        <w:t xml:space="preserve">Method 2, AI (a trained neural network), is a model trained to predict the answer</w:t>
       </w:r>
       <w:r>
         <w:t xml:space="preserve"> </w:t>
@@ -546,44 +453,18 @@
         <w:pStyle w:val="FirstParagraph"/>
       </w:pPr>
       <w:r>
-        <w:t xml:space="preserve">The central question for a decision-maker:</w:t>
-      </w:r>
-      <w:r>
-        <w:t xml:space="preserve"> </w:t>
-      </w:r>
-      <w:r>
-        <w:rPr>
-          <w:bCs/>
-          <w:b/>
-        </w:rPr>
-        <w:t xml:space="preserve">if you trusted the AI’s battery-size</w:t>
-      </w:r>
-      <w:r>
-        <w:rPr>
-          <w:bCs/>
-          <w:b/>
-        </w:rPr>
-        <w:t xml:space="preserve"> </w:t>
-      </w:r>
-      <w:r>
-        <w:rPr>
-          <w:bCs/>
-          <w:b/>
-        </w:rPr>
+        <w:t xml:space="preserve">The central question for a decision-maker: if you trusted the AI’s battery-size</w:t>
+      </w:r>
+      <w:r>
+        <w:t xml:space="preserve"> </w:t>
+      </w:r>
+      <w:r>
         <w:t xml:space="preserve">recommendation instead of running the full simulation, how much extra would it cost</w:t>
       </w:r>
       <w:r>
-        <w:rPr>
-          <w:bCs/>
-          <w:b/>
-        </w:rPr>
-        <w:t xml:space="preserve"> </w:t>
-      </w:r>
-      <w:r>
-        <w:rPr>
-          <w:bCs/>
-          <w:b/>
-        </w:rPr>
+        <w:t xml:space="preserve"> </w:t>
+      </w:r>
+      <w:r>
         <w:t xml:space="preserve">you?</w:t>
       </w:r>
     </w:p>
@@ -616,33 +497,13 @@
         <w:pStyle w:val="Compact"/>
       </w:pPr>
       <w:r>
-        <w:rPr>
-          <w:bCs/>
-          <w:b/>
-        </w:rPr>
-        <w:t xml:space="preserve">With a small amount of training data (100 example projects):</w:t>
-      </w:r>
-      <w:r>
-        <w:t xml:space="preserve"> </w:t>
-      </w:r>
-      <w:r>
-        <w:t xml:space="preserve">the AI’s</w:t>
-      </w:r>
-      <w:r>
-        <w:t xml:space="preserve"> </w:t>
-      </w:r>
-      <w:r>
-        <w:t xml:space="preserve">recommendations would have cost, on average,</w:t>
-      </w:r>
-      <w:r>
-        <w:t xml:space="preserve"> </w:t>
-      </w:r>
-      <w:r>
-        <w:rPr>
-          <w:bCs/>
-          <w:b/>
-        </w:rPr>
-        <w:t xml:space="preserve">an extra 3.6 cents per kilowatt-hour</w:t>
+        <w:t xml:space="preserve">With a small amount of training data (100 example projects), the AI’s</w:t>
+      </w:r>
+      <w:r>
+        <w:t xml:space="preserve"> </w:t>
+      </w:r>
+      <w:r>
+        <w:t xml:space="preserve">recommendations would have cost, on average, an extra 3.6 cents per kilowatt-hour</w:t>
       </w:r>
       <w:r>
         <w:t xml:space="preserve"> </w:t>
@@ -672,53 +533,19 @@
         <w:pStyle w:val="Compact"/>
       </w:pPr>
       <w:r>
-        <w:rPr>
-          <w:bCs/>
-          <w:b/>
-        </w:rPr>
-        <w:t xml:space="preserve">With a larger amount of training data (5,000 example projects):</w:t>
-      </w:r>
-      <w:r>
-        <w:t xml:space="preserve"> </w:t>
-      </w:r>
-      <w:r>
-        <w:t xml:space="preserve">the same AI</w:t>
-      </w:r>
-      <w:r>
-        <w:t xml:space="preserve"> </w:t>
-      </w:r>
-      <w:r>
-        <w:t xml:space="preserve">architecture, trained on more examples, would have cost only</w:t>
-      </w:r>
-      <w:r>
-        <w:t xml:space="preserve"> </w:t>
-      </w:r>
-      <w:r>
-        <w:rPr>
-          <w:bCs/>
-          <w:b/>
-        </w:rPr>
-        <w:t xml:space="preserve">0.03 cents per</w:t>
-      </w:r>
-      <w:r>
-        <w:rPr>
-          <w:bCs/>
-          <w:b/>
-        </w:rPr>
-        <w:t xml:space="preserve"> </w:t>
-      </w:r>
-      <w:r>
-        <w:rPr>
-          <w:bCs/>
-          <w:b/>
-        </w:rPr>
-        <w:t xml:space="preserve">kilowatt-hour extra</w:t>
-      </w:r>
-      <w:r>
-        <w:t xml:space="preserve"> </w:t>
-      </w:r>
-      <w:r>
-        <w:t xml:space="preserve">— a negligible amount, essentially free compared to the true</w:t>
+        <w:t xml:space="preserve">With a larger amount of training data (5,000 example projects), the same AI</w:t>
+      </w:r>
+      <w:r>
+        <w:t xml:space="preserve"> </w:t>
+      </w:r>
+      <w:r>
+        <w:t xml:space="preserve">architecture, trained on more examples, would have cost only 0.03 cents per</w:t>
+      </w:r>
+      <w:r>
+        <w:t xml:space="preserve"> </w:t>
+      </w:r>
+      <w:r>
+        <w:t xml:space="preserve">kilowatt-hour extra — a negligible amount, essentially free compared to the true</w:t>
       </w:r>
       <w:r>
         <w:t xml:space="preserve"> </w:t>
@@ -801,41 +628,31 @@
         <w:pStyle w:val="BodyText"/>
       </w:pPr>
       <w:r>
-        <w:rPr>
-          <w:bCs/>
-          <w:b/>
-        </w:rPr>
-        <w:t xml:space="preserve">The takeaway for investors:</w:t>
-      </w:r>
-      <w:r>
-        <w:t xml:space="preserve"> </w:t>
-      </w:r>
-      <w:r>
-        <w:t xml:space="preserve">an AI model is only as good as the data used to train</w:t>
-      </w:r>
-      <w:r>
-        <w:t xml:space="preserve"> </w:t>
-      </w:r>
-      <w:r>
-        <w:t xml:space="preserve">it. A model trained on too few examples can give recommendations that are actively</w:t>
-      </w:r>
-      <w:r>
-        <w:t xml:space="preserve"> </w:t>
-      </w:r>
-      <w:r>
-        <w:t xml:space="preserve">worse than a naive guess. The same model, given enough training data, becomes</w:t>
-      </w:r>
-      <w:r>
-        <w:t xml:space="preserve"> </w:t>
-      </w:r>
-      <w:r>
-        <w:t xml:space="preserve">essentially as reliable as the full engineering calculation — while still being</w:t>
-      </w:r>
-      <w:r>
-        <w:t xml:space="preserve"> </w:t>
-      </w:r>
-      <w:r>
-        <w:t xml:space="preserve">thousands of times faster to run.</w:t>
+        <w:t xml:space="preserve">The takeaway for investors: an AI model is only as good as the data used to train it.</w:t>
+      </w:r>
+      <w:r>
+        <w:t xml:space="preserve"> </w:t>
+      </w:r>
+      <w:r>
+        <w:t xml:space="preserve">A model trained on too few examples can give recommendations that are actively worse</w:t>
+      </w:r>
+      <w:r>
+        <w:t xml:space="preserve"> </w:t>
+      </w:r>
+      <w:r>
+        <w:t xml:space="preserve">than a naive guess. The same model, given enough training data, becomes essentially</w:t>
+      </w:r>
+      <w:r>
+        <w:t xml:space="preserve"> </w:t>
+      </w:r>
+      <w:r>
+        <w:t xml:space="preserve">as reliable as the full engineering calculation — while still being thousands of</w:t>
+      </w:r>
+      <w:r>
+        <w:t xml:space="preserve"> </w:t>
+      </w:r>
+      <w:r>
+        <w:t xml:space="preserve">times faster to run.</w:t>
       </w:r>
     </w:p>
     <w:bookmarkEnd w:id="28"/>
@@ -853,30 +670,12 @@
         <w:pStyle w:val="FirstParagraph"/>
       </w:pPr>
       <w:r>
-        <w:t xml:space="preserve">A separate, equally important question:</w:t>
-      </w:r>
-      <w:r>
-        <w:t xml:space="preserve"> </w:t>
-      </w:r>
-      <w:r>
-        <w:rPr>
-          <w:bCs/>
-          <w:b/>
-        </w:rPr>
-        <w:t xml:space="preserve">does the AI’s recommended battery size</w:t>
-      </w:r>
-      <w:r>
-        <w:rPr>
-          <w:bCs/>
-          <w:b/>
-        </w:rPr>
-        <w:t xml:space="preserve"> </w:t>
-      </w:r>
-      <w:r>
-        <w:rPr>
-          <w:bCs/>
-          <w:b/>
-        </w:rPr>
+        <w:t xml:space="preserve">A separate, equally important question: does the AI’s recommended battery size</w:t>
+      </w:r>
+      <w:r>
+        <w:t xml:space="preserve"> </w:t>
+      </w:r>
+      <w:r>
         <w:t xml:space="preserve">actually keep the lights on?</w:t>
       </w:r>
     </w:p>
@@ -891,51 +690,19 @@
         <w:t xml:space="preserve"> </w:t>
       </w:r>
       <w:r>
-        <w:t xml:space="preserve">demand, the answer here is reassuring on its own:</w:t>
-      </w:r>
-      <w:r>
-        <w:t xml:space="preserve"> </w:t>
-      </w:r>
-      <w:r>
-        <w:rPr>
-          <w:bCs/>
-          <w:b/>
-        </w:rPr>
-        <w:t xml:space="preserve">every battery size tested — no</w:t>
-      </w:r>
-      <w:r>
-        <w:rPr>
-          <w:bCs/>
-          <w:b/>
-        </w:rPr>
-        <w:t xml:space="preserve"> </w:t>
-      </w:r>
-      <w:r>
-        <w:rPr>
-          <w:bCs/>
-          <w:b/>
-        </w:rPr>
+        <w:t xml:space="preserve">demand, the answer here is reassuring on its own: every battery size tested — no</w:t>
+      </w:r>
+      <w:r>
+        <w:t xml:space="preserve"> </w:t>
+      </w:r>
+      <w:r>
         <w:t xml:space="preserve">matter which method chose it, and no matter how accurate that method was — resulted</w:t>
       </w:r>
       <w:r>
-        <w:rPr>
-          <w:bCs/>
-          <w:b/>
-        </w:rPr>
-        <w:t xml:space="preserve"> </w:t>
-      </w:r>
-      <w:r>
-        <w:rPr>
-          <w:bCs/>
-          <w:b/>
-        </w:rPr>
-        <w:t xml:space="preserve">in 100% reliability.</w:t>
-      </w:r>
-      <w:r>
-        <w:t xml:space="preserve"> </w:t>
-      </w:r>
-      <w:r>
-        <w:t xml:space="preserve">The diesel generator’s job is precisely to make sure a</w:t>
+        <w:t xml:space="preserve"> </w:t>
+      </w:r>
+      <w:r>
+        <w:t xml:space="preserve">in 100% reliability. The diesel generator’s job is precisely to make sure a</w:t>
       </w:r>
       <w:r>
         <w:t xml:space="preserve"> </w:t>
@@ -973,37 +740,13 @@
         <w:pStyle w:val="BodyText"/>
       </w:pPr>
       <w:r>
-        <w:t xml:space="preserve">This matters practically:</w:t>
-      </w:r>
-      <w:r>
-        <w:t xml:space="preserve"> </w:t>
-      </w:r>
-      <w:r>
-        <w:rPr>
-          <w:bCs/>
-          <w:b/>
-        </w:rPr>
-        <w:t xml:space="preserve">a project will not go dark because the AI’s battery-size</w:t>
-      </w:r>
-      <w:r>
-        <w:rPr>
-          <w:bCs/>
-          <w:b/>
-        </w:rPr>
-        <w:t xml:space="preserve"> </w:t>
-      </w:r>
-      <w:r>
-        <w:rPr>
-          <w:bCs/>
-          <w:b/>
-        </w:rPr>
-        <w:t xml:space="preserve">guess was slightly off.</w:t>
-      </w:r>
-      <w:r>
-        <w:t xml:space="preserve"> </w:t>
-      </w:r>
-      <w:r>
-        <w:t xml:space="preserve">The financial risk from an inaccurate AI recommendation is</w:t>
+        <w:t xml:space="preserve">This matters practically: a project will not go dark because the AI’s battery-size</w:t>
+      </w:r>
+      <w:r>
+        <w:t xml:space="preserve"> </w:t>
+      </w:r>
+      <w:r>
+        <w:t xml:space="preserve">guess was slightly off. The financial risk from an inaccurate AI recommendation is</w:t>
       </w:r>
       <w:r>
         <w:t xml:space="preserve"> </w:t>
@@ -1095,37 +838,13 @@
         <w:pStyle w:val="BodyText"/>
       </w:pPr>
       <w:r>
-        <w:t xml:space="preserve">In this study, that break-even point was consistently</w:t>
-      </w:r>
-      <w:r>
-        <w:t xml:space="preserve"> </w:t>
-      </w:r>
-      <w:r>
-        <w:rPr>
-          <w:bCs/>
-          <w:b/>
-        </w:rPr>
-        <w:t xml:space="preserve">just above the number of</w:t>
-      </w:r>
-      <w:r>
-        <w:rPr>
-          <w:bCs/>
-          <w:b/>
-        </w:rPr>
-        <w:t xml:space="preserve"> </w:t>
-      </w:r>
-      <w:r>
-        <w:rPr>
-          <w:bCs/>
-          <w:b/>
-        </w:rPr>
-        <w:t xml:space="preserve">example projects used to train the model</w:t>
-      </w:r>
-      <w:r>
-        <w:t xml:space="preserve"> </w:t>
-      </w:r>
-      <w:r>
-        <w:t xml:space="preserve">— for a model trained on 100 examples, AI</w:t>
+        <w:t xml:space="preserve">In this study, that break-even point was consistently just above the number of</w:t>
+      </w:r>
+      <w:r>
+        <w:t xml:space="preserve"> </w:t>
+      </w:r>
+      <w:r>
+        <w:t xml:space="preserve">example projects used to train the model — for a model trained on 100 examples, AI</w:t>
       </w:r>
       <w:r>
         <w:t xml:space="preserve"> </w:t>
@@ -1145,47 +864,37 @@
         <w:pStyle w:val="BodyText"/>
       </w:pPr>
       <w:r>
-        <w:rPr>
-          <w:bCs/>
-          <w:b/>
-        </w:rPr>
-        <w:t xml:space="preserve">Practical translation:</w:t>
-      </w:r>
-      <w:r>
-        <w:t xml:space="preserve"> </w:t>
-      </w:r>
-      <w:r>
-        <w:t xml:space="preserve">AI is worth the investment when a developer or investor</w:t>
-      </w:r>
-      <w:r>
-        <w:t xml:space="preserve"> </w:t>
-      </w:r>
-      <w:r>
-        <w:t xml:space="preserve">needs to rapidly screen a large number of candidate projects or system</w:t>
-      </w:r>
-      <w:r>
-        <w:t xml:space="preserve"> </w:t>
-      </w:r>
-      <w:r>
-        <w:t xml:space="preserve">configurations — for example, comparing hundreds of potential sites, or running rapid</w:t>
-      </w:r>
-      <w:r>
-        <w:t xml:space="preserve"> </w:t>
-      </w:r>
-      <w:r>
-        <w:t xml:space="preserve">what-if analysis across many possible equipment combinations. For a single one-off</w:t>
-      </w:r>
-      <w:r>
-        <w:t xml:space="preserve"> </w:t>
-      </w:r>
-      <w:r>
-        <w:t xml:space="preserve">project evaluation, the traditional simulation is already fast enough and remains the</w:t>
-      </w:r>
-      <w:r>
-        <w:t xml:space="preserve"> </w:t>
-      </w:r>
-      <w:r>
-        <w:t xml:space="preserve">more directly trustworthy choice.</w:t>
+        <w:t xml:space="preserve">Practical translation: AI is worth the investment when a developer or investor needs</w:t>
+      </w:r>
+      <w:r>
+        <w:t xml:space="preserve"> </w:t>
+      </w:r>
+      <w:r>
+        <w:t xml:space="preserve">to rapidly screen a large number of candidate projects or system configurations —</w:t>
+      </w:r>
+      <w:r>
+        <w:t xml:space="preserve"> </w:t>
+      </w:r>
+      <w:r>
+        <w:t xml:space="preserve">for example, comparing hundreds of potential sites, or running rapid what-if analysis</w:t>
+      </w:r>
+      <w:r>
+        <w:t xml:space="preserve"> </w:t>
+      </w:r>
+      <w:r>
+        <w:t xml:space="preserve">across many possible equipment combinations. For a single one-off project evaluation,</w:t>
+      </w:r>
+      <w:r>
+        <w:t xml:space="preserve"> </w:t>
+      </w:r>
+      <w:r>
+        <w:t xml:space="preserve">the traditional simulation is already fast enough and remains the more directly</w:t>
+      </w:r>
+      <w:r>
+        <w:t xml:space="preserve"> </w:t>
+      </w:r>
+      <w:r>
+        <w:t xml:space="preserve">trustworthy choice.</w:t>
       </w:r>
     </w:p>
     <w:p>
@@ -1260,37 +969,19 @@
         <w:pStyle w:val="FirstParagraph"/>
       </w:pPr>
       <w:r>
-        <w:rPr>
-          <w:bCs/>
-          <w:b/>
-        </w:rPr>
-        <w:t xml:space="preserve">AI predictions should never be the final word on an actual battery purchase</w:t>
-      </w:r>
-      <w:r>
-        <w:rPr>
-          <w:bCs/>
-          <w:b/>
-        </w:rPr>
-        <w:t xml:space="preserve"> </w:t>
-      </w:r>
-      <w:r>
-        <w:rPr>
-          <w:bCs/>
-          <w:b/>
-        </w:rPr>
-        <w:t xml:space="preserve">decision without being checked against the full simulation first.</w:t>
-      </w:r>
-      <w:r>
-        <w:t xml:space="preserve"> </w:t>
-      </w:r>
-      <w:r>
-        <w:t xml:space="preserve">This is not a</w:t>
-      </w:r>
-      <w:r>
-        <w:t xml:space="preserve"> </w:t>
-      </w:r>
-      <w:r>
-        <w:t xml:space="preserve">hedge or a formality — it is the central, repeated finding of this study.</w:t>
+        <w:t xml:space="preserve">AI predictions should never be the final word on an actual battery purchase decision</w:t>
+      </w:r>
+      <w:r>
+        <w:t xml:space="preserve"> </w:t>
+      </w:r>
+      <w:r>
+        <w:t xml:space="preserve">without being checked against the full simulation first. This is not a hedge or a</w:t>
+      </w:r>
+      <w:r>
+        <w:t xml:space="preserve"> </w:t>
+      </w:r>
+      <w:r>
+        <w:t xml:space="preserve">formality — it is the central, repeated finding of this study.</w:t>
       </w:r>
     </w:p>
     <w:p>
@@ -1328,51 +1019,19 @@
         <w:t xml:space="preserve"> </w:t>
       </w:r>
       <w:r>
-        <w:t xml:space="preserve">errors were large enough to be actively costly.</w:t>
-      </w:r>
-      <w:r>
-        <w:t xml:space="preserve"> </w:t>
-      </w:r>
-      <w:r>
-        <w:rPr>
-          <w:bCs/>
-          <w:b/>
-        </w:rPr>
-        <w:t xml:space="preserve">The only way to know which</w:t>
-      </w:r>
-      <w:r>
-        <w:rPr>
-          <w:bCs/>
-          <w:b/>
-        </w:rPr>
-        <w:t xml:space="preserve"> </w:t>
-      </w:r>
-      <w:r>
-        <w:rPr>
-          <w:bCs/>
-          <w:b/>
-        </w:rPr>
-        <w:t xml:space="preserve">situation you are in for any given project is to check the AI’s answer against the</w:t>
-      </w:r>
-      <w:r>
-        <w:rPr>
-          <w:bCs/>
-          <w:b/>
-        </w:rPr>
-        <w:t xml:space="preserve"> </w:t>
-      </w:r>
-      <w:r>
-        <w:rPr>
-          <w:bCs/>
-          <w:b/>
-        </w:rPr>
-        <w:t xml:space="preserve">full simulation</w:t>
-      </w:r>
-      <w:r>
-        <w:t xml:space="preserve"> </w:t>
-      </w:r>
-      <w:r>
-        <w:t xml:space="preserve">— which, given the simulation only takes a fraction of a second per</w:t>
+        <w:t xml:space="preserve">errors were large enough to be actively costly. The only way to know which situation</w:t>
+      </w:r>
+      <w:r>
+        <w:t xml:space="preserve"> </w:t>
+      </w:r>
+      <w:r>
+        <w:t xml:space="preserve">you are in for any given project is to check the AI’s answer against the full</w:t>
+      </w:r>
+      <w:r>
+        <w:t xml:space="preserve"> </w:t>
+      </w:r>
+      <w:r>
+        <w:t xml:space="preserve">simulation — which, given the simulation only takes a fraction of a second per</w:t>
       </w:r>
       <w:r>
         <w:t xml:space="preserve"> </w:t>
@@ -1416,23 +1075,7 @@
         <w:pStyle w:val="FirstParagraph"/>
       </w:pPr>
       <w:r>
-        <w:t xml:space="preserve">The two methods differ fundamentally in how much you can trust</w:t>
-      </w:r>
-      <w:r>
-        <w:t xml:space="preserve"> </w:t>
-      </w:r>
-      <w:r>
-        <w:rPr>
-          <w:iCs/>
-          <w:i/>
-        </w:rPr>
-        <w:t xml:space="preserve">why</w:t>
-      </w:r>
-      <w:r>
-        <w:t xml:space="preserve"> </w:t>
-      </w:r>
-      <w:r>
-        <w:t xml:space="preserve">they gave a</w:t>
+        <w:t xml:space="preserve">The two methods differ fundamentally in how much you can trust why they gave a</w:t>
       </w:r>
       <w:r>
         <w:t xml:space="preserve"> </w:t>
@@ -1446,20 +1089,7 @@
         <w:pStyle w:val="BodyText"/>
       </w:pPr>
       <w:r>
-        <w:t xml:space="preserve">The mechanistic simulation is</w:t>
-      </w:r>
-      <w:r>
-        <w:t xml:space="preserve"> </w:t>
-      </w:r>
-      <w:r>
-        <w:rPr>
-          <w:bCs/>
-          <w:b/>
-        </w:rPr>
-        <w:t xml:space="preserve">fully transparent</w:t>
-      </w:r>
-      <w:r>
-        <w:t xml:space="preserve">: every input (weather, equipment</w:t>
+        <w:t xml:space="preserve">The mechanistic simulation is fully transparent: every input (weather, equipment</w:t>
       </w:r>
       <w:r>
         <w:t xml:space="preserve"> </w:t>
@@ -1521,65 +1151,37 @@
         <w:t xml:space="preserve"> </w:t>
       </w:r>
       <w:r>
-        <w:rPr>
-          <w:bCs/>
-          <w:b/>
-        </w:rPr>
         <w:t xml:space="preserve">“</w:t>
       </w:r>
       <w:r>
-        <w:rPr>
-          <w:bCs/>
-          <w:b/>
-        </w:rPr>
         <w:t xml:space="preserve">black box</w:t>
       </w:r>
       <w:r>
-        <w:rPr>
-          <w:bCs/>
-          <w:b/>
-        </w:rPr>
         <w:t xml:space="preserve">”</w:t>
       </w:r>
       <w:r>
         <w:t xml:space="preserve"> </w:t>
       </w:r>
       <w:r>
-        <w:t xml:space="preserve">by comparison: it is a mathematical function with</w:t>
-      </w:r>
-      <w:r>
-        <w:t xml:space="preserve"> </w:t>
-      </w:r>
-      <w:r>
-        <w:t xml:space="preserve">over 15,000 internal parameters, learned from examples, with no direct equation a</w:t>
-      </w:r>
-      <w:r>
-        <w:t xml:space="preserve"> </w:t>
-      </w:r>
-      <w:r>
-        <w:t xml:space="preserve">person can read and interpret. It cannot explain</w:t>
-      </w:r>
-      <w:r>
-        <w:t xml:space="preserve"> </w:t>
-      </w:r>
-      <w:r>
-        <w:rPr>
-          <w:iCs/>
-          <w:i/>
-        </w:rPr>
-        <w:t xml:space="preserve">why</w:t>
-      </w:r>
-      <w:r>
-        <w:t xml:space="preserve"> </w:t>
-      </w:r>
-      <w:r>
-        <w:t xml:space="preserve">it recommends a particular</w:t>
-      </w:r>
-      <w:r>
-        <w:t xml:space="preserve"> </w:t>
-      </w:r>
-      <w:r>
-        <w:t xml:space="preserve">battery size beyond</w:t>
+        <w:t xml:space="preserve">by comparison: it is a mathematical function with over</w:t>
+      </w:r>
+      <w:r>
+        <w:t xml:space="preserve"> </w:t>
+      </w:r>
+      <w:r>
+        <w:t xml:space="preserve">15,000 internal parameters, learned from examples, with no direct equation a person</w:t>
+      </w:r>
+      <w:r>
+        <w:t xml:space="preserve"> </w:t>
+      </w:r>
+      <w:r>
+        <w:t xml:space="preserve">can read and interpret. It cannot explain why it recommends a particular battery</w:t>
+      </w:r>
+      <w:r>
+        <w:t xml:space="preserve"> </w:t>
+      </w:r>
+      <w:r>
+        <w:t xml:space="preserve">size beyond</w:t>
       </w:r>
       <w:r>
         <w:t xml:space="preserve"> </w:t>
@@ -1597,19 +1199,19 @@
         <w:t xml:space="preserve"> </w:t>
       </w:r>
       <w:r>
-        <w:t xml:space="preserve">This is</w:t>
-      </w:r>
-      <w:r>
-        <w:t xml:space="preserve"> </w:t>
-      </w:r>
-      <w:r>
-        <w:t xml:space="preserve">a real limitation for regulatory, financing, or public-accountability contexts where</w:t>
-      </w:r>
-      <w:r>
-        <w:t xml:space="preserve"> </w:t>
-      </w:r>
-      <w:r>
-        <w:t xml:space="preserve">a documented, auditable justification is required, not just a number.</w:t>
+        <w:t xml:space="preserve">This is a real</w:t>
+      </w:r>
+      <w:r>
+        <w:t xml:space="preserve"> </w:t>
+      </w:r>
+      <w:r>
+        <w:t xml:space="preserve">limitation for regulatory, financing, or public-accountability contexts where a</w:t>
+      </w:r>
+      <w:r>
+        <w:t xml:space="preserve"> </w:t>
+      </w:r>
+      <w:r>
+        <w:t xml:space="preserve">documented, auditable justification is required, not just a number.</w:t>
       </w:r>
     </w:p>
     <w:bookmarkEnd w:id="35"/>
@@ -1627,17 +1229,7 @@
         <w:pStyle w:val="FirstParagraph"/>
       </w:pPr>
       <w:r>
-        <w:rPr>
-          <w:bCs/>
-          <w:b/>
-        </w:rPr>
-        <w:t xml:space="preserve">To use the mechanistic method</w:t>
-      </w:r>
-      <w:r>
-        <w:t xml:space="preserve"> </w:t>
-      </w:r>
-      <w:r>
-        <w:t xml:space="preserve">on a new site, a developer needs: a year of hourly</w:t>
+        <w:t xml:space="preserve">To use the mechanistic method on a new site, a developer needs: a year of hourly</w:t>
       </w:r>
       <w:r>
         <w:t xml:space="preserve"> </w:t>
@@ -1675,33 +1267,13 @@
         <w:pStyle w:val="BodyText"/>
       </w:pPr>
       <w:r>
-        <w:rPr>
-          <w:bCs/>
-          <w:b/>
-        </w:rPr>
-        <w:t xml:space="preserve">To use the AI method</w:t>
-      </w:r>
-      <w:r>
-        <w:t xml:space="preserve"> </w:t>
-      </w:r>
-      <w:r>
-        <w:t xml:space="preserve">on a new site (or, more precisely, to build a</w:t>
-      </w:r>
-      <w:r>
-        <w:t xml:space="preserve"> </w:t>
-      </w:r>
-      <w:r>
-        <w:rPr>
-          <w:iCs/>
-          <w:i/>
-        </w:rPr>
-        <w:t xml:space="preserve">trustworthy</w:t>
-      </w:r>
-      <w:r>
-        <w:t xml:space="preserve"> </w:t>
-      </w:r>
-      <w:r>
-        <w:t xml:space="preserve">AI model for a new context), a developer additionally needs a large number of example</w:t>
+        <w:t xml:space="preserve">To use the AI method on a new site (or, more precisely, to build a trustworthy AI</w:t>
+      </w:r>
+      <w:r>
+        <w:t xml:space="preserve"> </w:t>
+      </w:r>
+      <w:r>
+        <w:t xml:space="preserve">model for a new context), a developer additionally needs a large number of example</w:t>
       </w:r>
       <w:r>
         <w:t xml:space="preserve"> </w:t>
@@ -1777,17 +1349,7 @@
         <w:pStyle w:val="Compact"/>
       </w:pPr>
       <w:r>
-        <w:rPr>
-          <w:bCs/>
-          <w:b/>
-        </w:rPr>
-        <w:t xml:space="preserve">Geographic and climate transfer is untested.</w:t>
-      </w:r>
-      <w:r>
-        <w:t xml:space="preserve"> </w:t>
-      </w:r>
-      <w:r>
-        <w:t xml:space="preserve">This entire study used a single</w:t>
+        <w:t xml:space="preserve">Geographic and climate transfer is untested. This entire study used a single</w:t>
       </w:r>
       <w:r>
         <w:t xml:space="preserve"> </w:t>
@@ -1823,17 +1385,7 @@
         <w:pStyle w:val="Compact"/>
       </w:pPr>
       <w:r>
-        <w:rPr>
-          <w:bCs/>
-          <w:b/>
-        </w:rPr>
-        <w:t xml:space="preserve">Cost assumptions are point estimates, not guarantees.</w:t>
-      </w:r>
-      <w:r>
-        <w:t xml:space="preserve"> </w:t>
-      </w:r>
-      <w:r>
-        <w:t xml:space="preserve">Every cost figure used in</w:t>
+        <w:t xml:space="preserve">Cost assumptions are point estimates, not guarantees. Every cost figure used in</w:t>
       </w:r>
       <w:r>
         <w:t xml:space="preserve"> </w:t>
@@ -1875,17 +1427,7 @@
         <w:pStyle w:val="Compact"/>
       </w:pPr>
       <w:r>
-        <w:rPr>
-          <w:bCs/>
-          <w:b/>
-        </w:rPr>
-        <w:t xml:space="preserve">Equipment specifications are generic, not manufacturer-certified.</w:t>
-      </w:r>
-      <w:r>
-        <w:t xml:space="preserve"> </w:t>
-      </w:r>
-      <w:r>
-        <w:t xml:space="preserve">The wind</w:t>
+        <w:t xml:space="preserve">Equipment specifications are generic, not manufacturer-certified. The wind</w:t>
       </w:r>
       <w:r>
         <w:t xml:space="preserve"> </w:t>
@@ -1921,17 +1463,7 @@
         <w:pStyle w:val="Compact"/>
       </w:pPr>
       <w:r>
-        <w:rPr>
-          <w:bCs/>
-          <w:b/>
-        </w:rPr>
-        <w:t xml:space="preserve">The AI model’s accuracy is specific to this exact problem setup.</w:t>
-      </w:r>
-      <w:r>
-        <w:t xml:space="preserve"> </w:t>
-      </w:r>
-      <w:r>
-        <w:t xml:space="preserve">A change to</w:t>
+        <w:t xml:space="preserve">The AI model’s accuracy is specific to this exact problem setup. A change to</w:t>
       </w:r>
       <w:r>
         <w:t xml:space="preserve"> </w:t>
@@ -1977,43 +1509,25 @@
         <w:pStyle w:val="Compact"/>
       </w:pPr>
       <w:r>
-        <w:rPr>
-          <w:bCs/>
-          <w:b/>
-        </w:rPr>
-        <w:t xml:space="preserve">Use the mechanistic simulation as the basis for any actual investment</w:t>
-      </w:r>
-      <w:r>
-        <w:rPr>
-          <w:bCs/>
-          <w:b/>
-        </w:rPr>
-        <w:t xml:space="preserve"> </w:t>
-      </w:r>
-      <w:r>
-        <w:rPr>
-          <w:bCs/>
-          <w:b/>
-        </w:rPr>
-        <w:t xml:space="preserve">decision.</w:t>
-      </w:r>
-      <w:r>
-        <w:t xml:space="preserve"> </w:t>
-      </w:r>
-      <w:r>
-        <w:t xml:space="preserve">It is transparent, auditable, and — at the scale this study tested —</w:t>
-      </w:r>
-      <w:r>
-        <w:t xml:space="preserve"> </w:t>
-      </w:r>
-      <w:r>
-        <w:t xml:space="preserve">fast enough (a fraction of a second per candidate) that speed is not a compelling</w:t>
-      </w:r>
-      <w:r>
-        <w:t xml:space="preserve"> </w:t>
-      </w:r>
-      <w:r>
-        <w:t xml:space="preserve">reason to skip it for a single project evaluation.</w:t>
+        <w:t xml:space="preserve">Use the mechanistic simulation as the basis for any actual investment decision.</w:t>
+      </w:r>
+      <w:r>
+        <w:t xml:space="preserve"> </w:t>
+      </w:r>
+      <w:r>
+        <w:t xml:space="preserve">It is transparent, auditable, and — at the scale this study tested — fast enough</w:t>
+      </w:r>
+      <w:r>
+        <w:t xml:space="preserve"> </w:t>
+      </w:r>
+      <w:r>
+        <w:t xml:space="preserve">(a fraction of a second per candidate) that speed is not a compelling reason to</w:t>
+      </w:r>
+      <w:r>
+        <w:t xml:space="preserve"> </w:t>
+      </w:r>
+      <w:r>
+        <w:t xml:space="preserve">skip it for a single project evaluation.</w:t>
       </w:r>
     </w:p>
     <w:p>
@@ -2025,14 +1539,7 @@
         <w:pStyle w:val="Compact"/>
       </w:pPr>
       <w:r>
-        <w:rPr>
-          <w:bCs/>
-          <w:b/>
-        </w:rPr>
-        <w:t xml:space="preserve">Use AI only for fast screening across many candidate projects at once</w:t>
-      </w:r>
-      <w:r>
-        <w:t xml:space="preserve">, where</w:t>
+        <w:t xml:space="preserve">Use AI only for fast screening across many candidate projects at once, where</w:t>
       </w:r>
       <w:r>
         <w:t xml:space="preserve"> </w:t>
@@ -2068,31 +1575,13 @@
         <w:pStyle w:val="Compact"/>
       </w:pPr>
       <w:r>
-        <w:rPr>
-          <w:bCs/>
-          <w:b/>
-        </w:rPr>
         <w:t xml:space="preserve">Always verify an AI-shortlisted project with the full simulation before</w:t>
       </w:r>
       <w:r>
-        <w:rPr>
-          <w:bCs/>
-          <w:b/>
-        </w:rPr>
-        <w:t xml:space="preserve"> </w:t>
-      </w:r>
-      <w:r>
-        <w:rPr>
-          <w:bCs/>
-          <w:b/>
-        </w:rPr>
-        <w:t xml:space="preserve">committing capital.</w:t>
-      </w:r>
-      <w:r>
-        <w:t xml:space="preserve"> </w:t>
-      </w:r>
-      <w:r>
-        <w:t xml:space="preserve">This is the single most important operational safeguard</w:t>
+        <w:t xml:space="preserve"> </w:t>
+      </w:r>
+      <w:r>
+        <w:t xml:space="preserve">committing capital. This is the single most important operational safeguard</w:t>
       </w:r>
       <w:r>
         <w:t xml:space="preserve"> </w:t>
@@ -2116,31 +1605,13 @@
         <w:pStyle w:val="Compact"/>
       </w:pPr>
       <w:r>
-        <w:rPr>
-          <w:bCs/>
-          <w:b/>
-        </w:rPr>
         <w:t xml:space="preserve">Size the diesel backup generator conservatively (at or above the site’s peak</w:t>
       </w:r>
       <w:r>
-        <w:rPr>
-          <w:bCs/>
-          <w:b/>
-        </w:rPr>
-        <w:t xml:space="preserve"> </w:t>
-      </w:r>
-      <w:r>
-        <w:rPr>
-          <w:bCs/>
-          <w:b/>
-        </w:rPr>
-        <w:t xml:space="preserve">demand).</w:t>
-      </w:r>
-      <w:r>
-        <w:t xml:space="preserve"> </w:t>
-      </w:r>
-      <w:r>
-        <w:t xml:space="preserve">This is what makes the overall system forgiving of an imperfect</w:t>
+        <w:t xml:space="preserve"> </w:t>
+      </w:r>
+      <w:r>
+        <w:t xml:space="preserve">demand). This is what makes the overall system forgiving of an imperfect</w:t>
       </w:r>
       <w:r>
         <w:t xml:space="preserve"> </w:t>
@@ -2170,31 +1641,13 @@
         <w:pStyle w:val="Compact"/>
       </w:pPr>
       <w:r>
-        <w:rPr>
-          <w:bCs/>
-          <w:b/>
-        </w:rPr>
         <w:t xml:space="preserve">Before applying these findings to a new site, re-run the underlying analysis</w:t>
       </w:r>
       <w:r>
-        <w:rPr>
-          <w:bCs/>
-          <w:b/>
-        </w:rPr>
-        <w:t xml:space="preserve"> </w:t>
-      </w:r>
-      <w:r>
-        <w:rPr>
-          <w:bCs/>
-          <w:b/>
-        </w:rPr>
-        <w:t xml:space="preserve">on that site’s own weather and demand data.</w:t>
-      </w:r>
-      <w:r>
-        <w:t xml:space="preserve"> </w:t>
-      </w:r>
-      <w:r>
-        <w:t xml:space="preserve">Every specific number in this report</w:t>
+        <w:t xml:space="preserve"> </w:t>
+      </w:r>
+      <w:r>
+        <w:t xml:space="preserve">on that site’s own weather and demand data. Every specific number in this report</w:t>
       </w:r>
       <w:r>
         <w:t xml:space="preserve"> </w:t>

</xml_diff>

<commit_message>
Add direct mechanistic-vs-neural-network comparison plots (capacity, renewable share)
Both reports only showed the mechanistic-vs-AI comparison through summary
metrics (accuracy tables, extra-LCOE bar charts). Add
plot_capacity_comparison_line and plot_renewable_share_comparison_line
(src/visualization/plotting.py), wired into notebook 05's full-scale
verification section, plotting the mechanistic reference and neural-network
prediction side by side across all 751 test scenarios. Embed the resulting
figures (30, 31) in technical_report.md sec 16.2 and the capacity comparison
as Figure 3 in decision_maker_report.md, renumbering the later runtime
figure to Figure 4. Regenerate PDF/Word exports.
</commit_message>
<xml_diff>
--- a/reports/exports/decision_maker_report.docx
+++ b/reports/exports/decision_maker_report.docx
@@ -2,7 +2,7 @@
 <file path=word/document.xml><?xml version="1.0" encoding="utf-8"?>
 <w:document xmlns:w="http://schemas.openxmlformats.org/wordprocessingml/2006/main" xmlns:m="http://schemas.openxmlformats.org/officeDocument/2006/math" xmlns:r="http://schemas.openxmlformats.org/officeDocument/2006/relationships" xmlns:o="urn:schemas-microsoft-com:office:office" xmlns:v="urn:schemas-microsoft-com:vml" xmlns:w10="urn:schemas-microsoft-com:office:word" xmlns:a="http://schemas.openxmlformats.org/drawingml/2006/main" xmlns:pic="http://schemas.openxmlformats.org/drawingml/2006/picture" xmlns:wp="http://schemas.openxmlformats.org/drawingml/2006/wordprocessingDrawing">
   <w:body>
-    <w:bookmarkStart w:id="39" w:name="Xa7b18ad57846d4a23f20ad24ee8f3e6c977061f"/>
+    <w:bookmarkStart w:id="42" w:name="Xa7b18ad57846d4a23f20ad24ee8f3e6c977061f"/>
     <w:p>
       <w:pPr>
         <w:pStyle w:val="Heading1"/>
@@ -439,7 +439,7 @@
       </w:r>
     </w:p>
     <w:bookmarkEnd w:id="24"/>
-    <w:bookmarkStart w:id="28" w:name="cost-consequences"/>
+    <w:bookmarkStart w:id="31" w:name="cost-consequences"/>
     <w:p>
       <w:pPr>
         <w:pStyle w:val="Heading2"/>
@@ -655,246 +655,54 @@
         <w:t xml:space="preserve">times faster to run.</w:t>
       </w:r>
     </w:p>
-    <w:bookmarkEnd w:id="28"/>
-    <w:bookmarkStart w:id="29" w:name="reliability-risks"/>
-    <w:p>
-      <w:pPr>
-        <w:pStyle w:val="Heading2"/>
-      </w:pPr>
-      <w:r>
-        <w:t xml:space="preserve">4. Reliability Risks</w:t>
-      </w:r>
-    </w:p>
-    <w:p>
-      <w:pPr>
-        <w:pStyle w:val="FirstParagraph"/>
-      </w:pPr>
-      <w:r>
-        <w:t xml:space="preserve">A separate, equally important question: does the AI’s recommended battery size</w:t>
-      </w:r>
-      <w:r>
-        <w:t xml:space="preserve"> </w:t>
-      </w:r>
-      <w:r>
-        <w:t xml:space="preserve">actually keep the lights on?</w:t>
-      </w:r>
-    </w:p>
     <w:p>
       <w:pPr>
         <w:pStyle w:val="BodyText"/>
       </w:pPr>
       <w:r>
-        <w:t xml:space="preserve">Because this system includes a diesel generator sized to always cover the site’s peak</w:t>
-      </w:r>
-      <w:r>
-        <w:t xml:space="preserve"> </w:t>
-      </w:r>
-      <w:r>
-        <w:t xml:space="preserve">demand, the answer here is reassuring on its own: every battery size tested — no</w:t>
-      </w:r>
-      <w:r>
-        <w:t xml:space="preserve"> </w:t>
-      </w:r>
-      <w:r>
-        <w:t xml:space="preserve">matter which method chose it, and no matter how accurate that method was — resulted</w:t>
-      </w:r>
-      <w:r>
-        <w:t xml:space="preserve"> </w:t>
-      </w:r>
-      <w:r>
-        <w:t xml:space="preserve">in 100% reliability. The diesel generator’s job is precisely to make sure a</w:t>
-      </w:r>
-      <w:r>
-        <w:t xml:space="preserve"> </w:t>
-      </w:r>
-      <w:r>
-        <w:t xml:space="preserve">smaller-than-ideal battery never causes an outage; it just burns more fuel to</w:t>
-      </w:r>
-      <w:r>
-        <w:t xml:space="preserve"> </w:t>
-      </w:r>
-      <w:r>
-        <w:t xml:space="preserve">compensate, which is what shows up as the</w:t>
-      </w:r>
-      <w:r>
-        <w:t xml:space="preserve"> </w:t>
-      </w:r>
-      <w:r>
-        <w:t xml:space="preserve">“</w:t>
-      </w:r>
-      <w:r>
-        <w:t xml:space="preserve">extra cost</w:t>
-      </w:r>
-      <w:r>
-        <w:t xml:space="preserve">”</w:t>
-      </w:r>
-      <w:r>
-        <w:t xml:space="preserve"> </w:t>
-      </w:r>
-      <w:r>
-        <w:t xml:space="preserve">in Section 3.</w:t>
-      </w:r>
-    </w:p>
-    <w:p>
-      <w:pPr>
-        <w:pStyle w:val="BodyText"/>
-      </w:pPr>
-      <w:r>
-        <w:t xml:space="preserve">This matters practically: a project will not go dark because the AI’s battery-size</w:t>
-      </w:r>
-      <w:r>
-        <w:t xml:space="preserve"> </w:t>
-      </w:r>
-      <w:r>
-        <w:t xml:space="preserve">guess was slightly off. The financial risk from an inaccurate AI recommendation is</w:t>
-      </w:r>
-      <w:r>
-        <w:t xml:space="preserve"> </w:t>
-      </w:r>
-      <w:r>
-        <w:t xml:space="preserve">real (Section 3), but it is a cost-efficiency risk, not a power-supply risk, as long</w:t>
-      </w:r>
-      <w:r>
-        <w:t xml:space="preserve"> </w:t>
-      </w:r>
-      <w:r>
-        <w:t xml:space="preserve">as the diesel backup itself is not undersized. (A diesel generator that is</w:t>
-      </w:r>
-      <w:r>
-        <w:t xml:space="preserve"> </w:t>
-      </w:r>
-      <w:r>
-        <w:t xml:space="preserve">deliberately undersized relative to peak demand — which this study did not</w:t>
-      </w:r>
-      <w:r>
-        <w:t xml:space="preserve"> </w:t>
-      </w:r>
-      <w:r>
-        <w:t xml:space="preserve">recommend and does not use in its default design — would reintroduce a genuine</w:t>
-      </w:r>
-      <w:r>
-        <w:t xml:space="preserve"> </w:t>
-      </w:r>
-      <w:r>
-        <w:t xml:space="preserve">reliability risk; this was tested separately as a specific what-if scenario, not as</w:t>
-      </w:r>
-      <w:r>
-        <w:t xml:space="preserve"> </w:t>
-      </w:r>
-      <w:r>
-        <w:t xml:space="preserve">part of the standard design.)</w:t>
-      </w:r>
-    </w:p>
-    <w:bookmarkEnd w:id="29"/>
-    <w:bookmarkStart w:id="33" w:name="when-ai-is-useful"/>
-    <w:p>
-      <w:pPr>
-        <w:pStyle w:val="Heading2"/>
-      </w:pPr>
-      <w:r>
-        <w:t xml:space="preserve">5. When AI Is Useful</w:t>
-      </w:r>
-    </w:p>
-    <w:p>
-      <w:pPr>
-        <w:pStyle w:val="FirstParagraph"/>
-      </w:pPr>
-      <w:r>
-        <w:t xml:space="preserve">AI inference is dramatically faster than the full simulation (Figure 3) — a single</w:t>
-      </w:r>
-      <w:r>
-        <w:t xml:space="preserve"> </w:t>
-      </w:r>
-      <w:r>
-        <w:t xml:space="preserve">prediction takes a fraction of a millisecond, versus roughly a tenth to a third of a</w:t>
-      </w:r>
-      <w:r>
-        <w:t xml:space="preserve"> </w:t>
-      </w:r>
-      <w:r>
-        <w:t xml:space="preserve">second for the full simulation. But training an AI model itself takes time and</w:t>
-      </w:r>
-      <w:r>
-        <w:t xml:space="preserve"> </w:t>
-      </w:r>
-      <w:r>
-        <w:t xml:space="preserve">requires generating training examples with the (slower) mechanistic method first.</w:t>
-      </w:r>
-      <w:r>
-        <w:t xml:space="preserve"> </w:t>
-      </w:r>
-      <w:r>
-        <w:t xml:space="preserve">This means AI only pays off once it is used enough times to recoup that upfront</w:t>
-      </w:r>
-      <w:r>
-        <w:t xml:space="preserve"> </w:t>
-      </w:r>
-      <w:r>
-        <w:t xml:space="preserve">cost.</w:t>
-      </w:r>
-    </w:p>
-    <w:p>
-      <w:pPr>
-        <w:pStyle w:val="BodyText"/>
-      </w:pPr>
-      <w:r>
-        <w:t xml:space="preserve">In this study, that break-even point was consistently just above the number of</w:t>
-      </w:r>
-      <w:r>
-        <w:t xml:space="preserve"> </w:t>
-      </w:r>
-      <w:r>
-        <w:t xml:space="preserve">example projects used to train the model — for a model trained on 100 examples, AI</w:t>
-      </w:r>
-      <w:r>
-        <w:t xml:space="preserve"> </w:t>
-      </w:r>
-      <w:r>
-        <w:t xml:space="preserve">became worth it after roughly 100–130 total evaluations; for a model trained on 5,000</w:t>
-      </w:r>
-      <w:r>
-        <w:t xml:space="preserve"> </w:t>
-      </w:r>
-      <w:r>
-        <w:t xml:space="preserve">examples, after roughly 5,000–5,200 evaluations.</w:t>
-      </w:r>
-    </w:p>
-    <w:p>
-      <w:pPr>
-        <w:pStyle w:val="BodyText"/>
-      </w:pPr>
-      <w:r>
-        <w:t xml:space="preserve">Practical translation: AI is worth the investment when a developer or investor needs</w:t>
-      </w:r>
-      <w:r>
-        <w:t xml:space="preserve"> </w:t>
-      </w:r>
-      <w:r>
-        <w:t xml:space="preserve">to rapidly screen a large number of candidate projects or system configurations —</w:t>
-      </w:r>
-      <w:r>
-        <w:t xml:space="preserve"> </w:t>
-      </w:r>
-      <w:r>
-        <w:t xml:space="preserve">for example, comparing hundreds of potential sites, or running rapid what-if analysis</w:t>
-      </w:r>
-      <w:r>
-        <w:t xml:space="preserve"> </w:t>
-      </w:r>
-      <w:r>
-        <w:t xml:space="preserve">across many possible equipment combinations. For a single one-off project evaluation,</w:t>
-      </w:r>
-      <w:r>
-        <w:t xml:space="preserve"> </w:t>
-      </w:r>
-      <w:r>
-        <w:t xml:space="preserve">the traditional simulation is already fast enough and remains the more directly</w:t>
-      </w:r>
-      <w:r>
-        <w:t xml:space="preserve"> </w:t>
-      </w:r>
-      <w:r>
-        <w:t xml:space="preserve">trustworthy choice.</w:t>
+        <w:t xml:space="preserve">Figure 3 shows this agreement directly, rather than through a single summary number.</w:t>
+      </w:r>
+      <w:r>
+        <w:t xml:space="preserve"> </w:t>
+      </w:r>
+      <w:r>
+        <w:t xml:space="preserve">It plots the battery size recommended by the traditional engineering calculation</w:t>
+      </w:r>
+      <w:r>
+        <w:t xml:space="preserve"> </w:t>
+      </w:r>
+      <w:r>
+        <w:t xml:space="preserve">against the battery size recommended by the well-trained AI, for all 751 test</w:t>
+      </w:r>
+      <w:r>
+        <w:t xml:space="preserve"> </w:t>
+      </w:r>
+      <w:r>
+        <w:t xml:space="preserve">projects, sorted from smallest to largest. The two lines follow each other closely</w:t>
+      </w:r>
+      <w:r>
+        <w:t xml:space="preserve"> </w:t>
+      </w:r>
+      <w:r>
+        <w:t xml:space="preserve">across the entire range, from small batteries (a few hundred kilowatt-hours) to</w:t>
+      </w:r>
+      <w:r>
+        <w:t xml:space="preserve"> </w:t>
+      </w:r>
+      <w:r>
+        <w:t xml:space="preserve">large ones (nearly 9,500 kilowatt-hours) — this is the well-trained AI’s</w:t>
+      </w:r>
+      <w:r>
+        <w:t xml:space="preserve"> </w:t>
+      </w:r>
+      <w:r>
+        <w:t xml:space="preserve">recommendation tracking the engineering calculation’s answer project by project, not</w:t>
+      </w:r>
+      <w:r>
+        <w:t xml:space="preserve"> </w:t>
+      </w:r>
+      <w:r>
+        <w:t xml:space="preserve">just matching it on average.</w:t>
       </w:r>
     </w:p>
     <w:p>
@@ -904,20 +712,319 @@
       <w:r>
         <w:drawing>
           <wp:inline>
-            <wp:extent cx="5334000" cy="3297709"/>
+            <wp:extent cx="5334000" cy="2637356"/>
             <wp:effectExtent b="0" l="0" r="0" t="0"/>
-            <wp:docPr descr="How long each step takes, from full simulation to AI prediction (log scale)" title="" id="31" name="Picture"/>
+            <wp:docPr descr="Battery size recommended by the traditional method vs. by the well-trained AI, across 751 test projects" title="" id="29" name="Picture"/>
             <a:graphic>
               <a:graphicData uri="http://schemas.openxmlformats.org/drawingml/2006/picture">
                 <pic:pic>
                   <pic:nvPicPr>
-                    <pic:cNvPr descr="../outputs/figures/24_runtime_comparison.png" id="32" name="Picture"/>
+                    <pic:cNvPr descr="../outputs/figures/30_capacity_comparison_neural_network_full.png" id="30" name="Picture"/>
                     <pic:cNvPicPr>
                       <a:picLocks noChangeArrowheads="1" noChangeAspect="1"/>
                     </pic:cNvPicPr>
                   </pic:nvPicPr>
                   <pic:blipFill>
-                    <a:blip r:embed="rId30"/>
+                    <a:blip r:embed="rId28"/>
+                    <a:stretch>
+                      <a:fillRect/>
+                    </a:stretch>
+                  </pic:blipFill>
+                  <pic:spPr bwMode="auto">
+                    <a:xfrm>
+                      <a:off x="0" y="0"/>
+                      <a:ext cx="5334000" cy="2637356"/>
+                    </a:xfrm>
+                    <a:prstGeom prst="rect">
+                      <a:avLst/>
+                    </a:prstGeom>
+                    <a:noFill/>
+                    <a:ln w="9525">
+                      <a:noFill/>
+                      <a:headEnd/>
+                      <a:tailEnd/>
+                    </a:ln>
+                  </pic:spPr>
+                </pic:pic>
+              </a:graphicData>
+            </a:graphic>
+          </wp:inline>
+        </w:drawing>
+      </w:r>
+      <w:r>
+        <w:t xml:space="preserve"> </w:t>
+      </w:r>
+      <w:r>
+        <w:rPr>
+          <w:iCs/>
+          <w:i/>
+        </w:rPr>
+        <w:t xml:space="preserve">Figure 3 — Battery size recommended by the traditional engineering calculation (black) vs. the well-trained AI (blue), for 751 test projects sorted by the traditional calculation’s answer. The two lines track closely across the full range of project sizes.</w:t>
+      </w:r>
+    </w:p>
+    <w:bookmarkEnd w:id="31"/>
+    <w:bookmarkStart w:id="32" w:name="reliability-risks"/>
+    <w:p>
+      <w:pPr>
+        <w:pStyle w:val="Heading2"/>
+      </w:pPr>
+      <w:r>
+        <w:t xml:space="preserve">4. Reliability Risks</w:t>
+      </w:r>
+    </w:p>
+    <w:p>
+      <w:pPr>
+        <w:pStyle w:val="FirstParagraph"/>
+      </w:pPr>
+      <w:r>
+        <w:t xml:space="preserve">A separate, equally important question: does the AI’s recommended battery size</w:t>
+      </w:r>
+      <w:r>
+        <w:t xml:space="preserve"> </w:t>
+      </w:r>
+      <w:r>
+        <w:t xml:space="preserve">actually keep the lights on?</w:t>
+      </w:r>
+    </w:p>
+    <w:p>
+      <w:pPr>
+        <w:pStyle w:val="BodyText"/>
+      </w:pPr>
+      <w:r>
+        <w:t xml:space="preserve">Because this system includes a diesel generator sized to always cover the site’s peak</w:t>
+      </w:r>
+      <w:r>
+        <w:t xml:space="preserve"> </w:t>
+      </w:r>
+      <w:r>
+        <w:t xml:space="preserve">demand, the answer here is reassuring on its own: every battery size tested — no</w:t>
+      </w:r>
+      <w:r>
+        <w:t xml:space="preserve"> </w:t>
+      </w:r>
+      <w:r>
+        <w:t xml:space="preserve">matter which method chose it, and no matter how accurate that method was — resulted</w:t>
+      </w:r>
+      <w:r>
+        <w:t xml:space="preserve"> </w:t>
+      </w:r>
+      <w:r>
+        <w:t xml:space="preserve">in 100% reliability. The diesel generator’s job is precisely to make sure a</w:t>
+      </w:r>
+      <w:r>
+        <w:t xml:space="preserve"> </w:t>
+      </w:r>
+      <w:r>
+        <w:t xml:space="preserve">smaller-than-ideal battery never causes an outage; it just burns more fuel to</w:t>
+      </w:r>
+      <w:r>
+        <w:t xml:space="preserve"> </w:t>
+      </w:r>
+      <w:r>
+        <w:t xml:space="preserve">compensate, which is what shows up as the</w:t>
+      </w:r>
+      <w:r>
+        <w:t xml:space="preserve"> </w:t>
+      </w:r>
+      <w:r>
+        <w:t xml:space="preserve">“</w:t>
+      </w:r>
+      <w:r>
+        <w:t xml:space="preserve">extra cost</w:t>
+      </w:r>
+      <w:r>
+        <w:t xml:space="preserve">”</w:t>
+      </w:r>
+      <w:r>
+        <w:t xml:space="preserve"> </w:t>
+      </w:r>
+      <w:r>
+        <w:t xml:space="preserve">in Section 3.</w:t>
+      </w:r>
+    </w:p>
+    <w:p>
+      <w:pPr>
+        <w:pStyle w:val="BodyText"/>
+      </w:pPr>
+      <w:r>
+        <w:t xml:space="preserve">This matters practically: a project will not go dark because the AI’s battery-size</w:t>
+      </w:r>
+      <w:r>
+        <w:t xml:space="preserve"> </w:t>
+      </w:r>
+      <w:r>
+        <w:t xml:space="preserve">guess was slightly off. The financial risk from an inaccurate AI recommendation is</w:t>
+      </w:r>
+      <w:r>
+        <w:t xml:space="preserve"> </w:t>
+      </w:r>
+      <w:r>
+        <w:t xml:space="preserve">real (Section 3), but it is a cost-efficiency risk, not a power-supply risk, as long</w:t>
+      </w:r>
+      <w:r>
+        <w:t xml:space="preserve"> </w:t>
+      </w:r>
+      <w:r>
+        <w:t xml:space="preserve">as the diesel backup itself is not undersized. (A diesel generator that is</w:t>
+      </w:r>
+      <w:r>
+        <w:t xml:space="preserve"> </w:t>
+      </w:r>
+      <w:r>
+        <w:t xml:space="preserve">deliberately undersized relative to peak demand — which this study did not</w:t>
+      </w:r>
+      <w:r>
+        <w:t xml:space="preserve"> </w:t>
+      </w:r>
+      <w:r>
+        <w:t xml:space="preserve">recommend and does not use in its default design — would reintroduce a genuine</w:t>
+      </w:r>
+      <w:r>
+        <w:t xml:space="preserve"> </w:t>
+      </w:r>
+      <w:r>
+        <w:t xml:space="preserve">reliability risk; this was tested separately as a specific what-if scenario, not as</w:t>
+      </w:r>
+      <w:r>
+        <w:t xml:space="preserve"> </w:t>
+      </w:r>
+      <w:r>
+        <w:t xml:space="preserve">part of the standard design.)</w:t>
+      </w:r>
+    </w:p>
+    <w:bookmarkEnd w:id="32"/>
+    <w:bookmarkStart w:id="36" w:name="when-ai-is-useful"/>
+    <w:p>
+      <w:pPr>
+        <w:pStyle w:val="Heading2"/>
+      </w:pPr>
+      <w:r>
+        <w:t xml:space="preserve">5. When AI Is Useful</w:t>
+      </w:r>
+    </w:p>
+    <w:p>
+      <w:pPr>
+        <w:pStyle w:val="FirstParagraph"/>
+      </w:pPr>
+      <w:r>
+        <w:t xml:space="preserve">AI inference is dramatically faster than the full simulation (Figure 4) — a single</w:t>
+      </w:r>
+      <w:r>
+        <w:t xml:space="preserve"> </w:t>
+      </w:r>
+      <w:r>
+        <w:t xml:space="preserve">prediction takes a fraction of a millisecond, versus roughly a tenth to a third of a</w:t>
+      </w:r>
+      <w:r>
+        <w:t xml:space="preserve"> </w:t>
+      </w:r>
+      <w:r>
+        <w:t xml:space="preserve">second for the full simulation. But training an AI model itself takes time and</w:t>
+      </w:r>
+      <w:r>
+        <w:t xml:space="preserve"> </w:t>
+      </w:r>
+      <w:r>
+        <w:t xml:space="preserve">requires generating training examples with the (slower) mechanistic method first.</w:t>
+      </w:r>
+      <w:r>
+        <w:t xml:space="preserve"> </w:t>
+      </w:r>
+      <w:r>
+        <w:t xml:space="preserve">This means AI only pays off once it is used enough times to recoup that upfront</w:t>
+      </w:r>
+      <w:r>
+        <w:t xml:space="preserve"> </w:t>
+      </w:r>
+      <w:r>
+        <w:t xml:space="preserve">cost.</w:t>
+      </w:r>
+    </w:p>
+    <w:p>
+      <w:pPr>
+        <w:pStyle w:val="BodyText"/>
+      </w:pPr>
+      <w:r>
+        <w:t xml:space="preserve">In this study, that break-even point was consistently just above the number of</w:t>
+      </w:r>
+      <w:r>
+        <w:t xml:space="preserve"> </w:t>
+      </w:r>
+      <w:r>
+        <w:t xml:space="preserve">example projects used to train the model — for a model trained on 100 examples, AI</w:t>
+      </w:r>
+      <w:r>
+        <w:t xml:space="preserve"> </w:t>
+      </w:r>
+      <w:r>
+        <w:t xml:space="preserve">became worth it after roughly 100–130 total evaluations; for a model trained on 5,000</w:t>
+      </w:r>
+      <w:r>
+        <w:t xml:space="preserve"> </w:t>
+      </w:r>
+      <w:r>
+        <w:t xml:space="preserve">examples, after roughly 5,000–5,200 evaluations.</w:t>
+      </w:r>
+    </w:p>
+    <w:p>
+      <w:pPr>
+        <w:pStyle w:val="BodyText"/>
+      </w:pPr>
+      <w:r>
+        <w:t xml:space="preserve">Practical translation: AI is worth the investment when a developer or investor needs</w:t>
+      </w:r>
+      <w:r>
+        <w:t xml:space="preserve"> </w:t>
+      </w:r>
+      <w:r>
+        <w:t xml:space="preserve">to rapidly screen a large number of candidate projects or system configurations —</w:t>
+      </w:r>
+      <w:r>
+        <w:t xml:space="preserve"> </w:t>
+      </w:r>
+      <w:r>
+        <w:t xml:space="preserve">for example, comparing hundreds of potential sites, or running rapid what-if analysis</w:t>
+      </w:r>
+      <w:r>
+        <w:t xml:space="preserve"> </w:t>
+      </w:r>
+      <w:r>
+        <w:t xml:space="preserve">across many possible equipment combinations. For a single one-off project evaluation,</w:t>
+      </w:r>
+      <w:r>
+        <w:t xml:space="preserve"> </w:t>
+      </w:r>
+      <w:r>
+        <w:t xml:space="preserve">the traditional simulation is already fast enough and remains the more directly</w:t>
+      </w:r>
+      <w:r>
+        <w:t xml:space="preserve"> </w:t>
+      </w:r>
+      <w:r>
+        <w:t xml:space="preserve">trustworthy choice.</w:t>
+      </w:r>
+    </w:p>
+    <w:p>
+      <w:pPr>
+        <w:pStyle w:val="BodyText"/>
+      </w:pPr>
+      <w:r>
+        <w:drawing>
+          <wp:inline>
+            <wp:extent cx="5334000" cy="3297709"/>
+            <wp:effectExtent b="0" l="0" r="0" t="0"/>
+            <wp:docPr descr="How long each step takes, from full simulation to AI prediction (log scale)" title="" id="34" name="Picture"/>
+            <a:graphic>
+              <a:graphicData uri="http://schemas.openxmlformats.org/drawingml/2006/picture">
+                <pic:pic>
+                  <pic:nvPicPr>
+                    <pic:cNvPr descr="../outputs/figures/24_runtime_comparison.png" id="35" name="Picture"/>
+                    <pic:cNvPicPr>
+                      <a:picLocks noChangeArrowheads="1" noChangeAspect="1"/>
+                    </pic:cNvPicPr>
+                  </pic:nvPicPr>
+                  <pic:blipFill>
+                    <a:blip r:embed="rId33"/>
                     <a:stretch>
                       <a:fillRect/>
                     </a:stretch>
@@ -951,11 +1058,11 @@
           <w:iCs/>
           <w:i/>
         </w:rPr>
-        <w:t xml:space="preserve">Figure 3 — Time required per evaluation, from slowest (full mechanistic simulation) to fastest (AI inference) — note the scale is logarithmic, so each step down is roughly a 10x-1000x speed difference.</w:t>
-      </w:r>
-    </w:p>
-    <w:bookmarkEnd w:id="33"/>
-    <w:bookmarkStart w:id="34" w:name="Xb9b126069a4f018084d0da23d969ee6e78da413"/>
+        <w:t xml:space="preserve">Figure 4 — Time required per evaluation, from slowest (full mechanistic simulation) to fastest (AI inference) — note the scale is logarithmic, so each step down is roughly a 10x-1000x speed difference.</w:t>
+      </w:r>
+    </w:p>
+    <w:bookmarkEnd w:id="36"/>
+    <w:bookmarkStart w:id="37" w:name="Xb9b126069a4f018084d0da23d969ee6e78da413"/>
     <w:p>
       <w:pPr>
         <w:pStyle w:val="Heading2"/>
@@ -1060,8 +1167,8 @@
         <w:t xml:space="preserve">candidates are shortlisted for actual investment, before committing capital.</w:t>
       </w:r>
     </w:p>
-    <w:bookmarkEnd w:id="34"/>
-    <w:bookmarkStart w:id="35" w:name="interpretability"/>
+    <w:bookmarkEnd w:id="37"/>
+    <w:bookmarkStart w:id="38" w:name="interpretability"/>
     <w:p>
       <w:pPr>
         <w:pStyle w:val="Heading2"/>
@@ -1214,8 +1321,8 @@
         <w:t xml:space="preserve">documented, auditable justification is required, not just a number.</w:t>
       </w:r>
     </w:p>
-    <w:bookmarkEnd w:id="35"/>
-    <w:bookmarkStart w:id="36" w:name="data-requirements"/>
+    <w:bookmarkEnd w:id="38"/>
+    <w:bookmarkStart w:id="39" w:name="data-requirements"/>
     <w:p>
       <w:pPr>
         <w:pStyle w:val="Heading2"/>
@@ -1330,8 +1437,8 @@
         <w:t xml:space="preserve">a new context (new geography, new climate, new equipment class).</w:t>
       </w:r>
     </w:p>
-    <w:bookmarkEnd w:id="36"/>
-    <w:bookmarkStart w:id="37" w:name="implementation-risks"/>
+    <w:bookmarkEnd w:id="39"/>
+    <w:bookmarkStart w:id="40" w:name="implementation-risks"/>
     <w:p>
       <w:pPr>
         <w:pStyle w:val="Heading2"/>
@@ -1490,8 +1597,8 @@
         <w:t xml:space="preserve">materially different project designs without retraining.</w:t>
       </w:r>
     </w:p>
-    <w:bookmarkEnd w:id="37"/>
-    <w:bookmarkStart w:id="38" w:name="recommendations"/>
+    <w:bookmarkEnd w:id="40"/>
+    <w:bookmarkStart w:id="41" w:name="recommendations"/>
     <w:p>
       <w:pPr>
         <w:pStyle w:val="Heading2"/>
@@ -1674,8 +1781,8 @@
         <w:t xml:space="preserve">universal figures to copy into a different project.</w:t>
       </w:r>
     </w:p>
-    <w:bookmarkEnd w:id="38"/>
-    <w:bookmarkEnd w:id="39"/>
+    <w:bookmarkEnd w:id="41"/>
+    <w:bookmarkEnd w:id="42"/>
     <w:sectPr/>
   </w:body>
 </w:document>

</xml_diff>

<commit_message>
Add mechanistic-curve-with-AI-prediction figure; document load-profile scope gap
Add plot_system_lcoe_curve_with_ai_prediction, matching Figure 27's exact
chart style (System LCOE vs. battery capacity, one scenario's full
candidate sweep) but with the mechanistic optimum and the neural network's
predicted capacity both marked on the curve. Figure 27's own baseline
scenario can't be reused for this: its industrial_baseline load shape is
not achievable under generate_load_profile's default residential_baseline
shape, which every sampled scenario in the ML dataset actually uses (a
mismatch confirmed directly and now documented in the Limitations
section) -- so the new figure instead uses a representative test-split
scenario the model was actually evaluated on. Embed as Figure 32 in
technical_report.md and Figure 3 in decision_maker_report.md (renumbering
later figures). Regenerate PDF/Word exports.
</commit_message>
<xml_diff>
--- a/reports/exports/decision_maker_report.docx
+++ b/reports/exports/decision_maker_report.docx
@@ -2,7 +2,7 @@
 <file path=word/document.xml><?xml version="1.0" encoding="utf-8"?>
 <w:document xmlns:w="http://schemas.openxmlformats.org/wordprocessingml/2006/main" xmlns:m="http://schemas.openxmlformats.org/officeDocument/2006/math" xmlns:r="http://schemas.openxmlformats.org/officeDocument/2006/relationships" xmlns:o="urn:schemas-microsoft-com:office:office" xmlns:v="urn:schemas-microsoft-com:vml" xmlns:w10="urn:schemas-microsoft-com:office:word" xmlns:a="http://schemas.openxmlformats.org/drawingml/2006/main" xmlns:pic="http://schemas.openxmlformats.org/drawingml/2006/picture" xmlns:wp="http://schemas.openxmlformats.org/drawingml/2006/wordprocessingDrawing">
   <w:body>
-    <w:bookmarkStart w:id="42" w:name="Xa7b18ad57846d4a23f20ad24ee8f3e6c977061f"/>
+    <w:bookmarkStart w:id="45" w:name="Xa7b18ad57846d4a23f20ad24ee8f3e6c977061f"/>
     <w:p>
       <w:pPr>
         <w:pStyle w:val="Heading1"/>
@@ -439,7 +439,7 @@
       </w:r>
     </w:p>
     <w:bookmarkEnd w:id="24"/>
-    <w:bookmarkStart w:id="31" w:name="cost-consequences"/>
+    <w:bookmarkStart w:id="34" w:name="cost-consequences"/>
     <w:p>
       <w:pPr>
         <w:pStyle w:val="Heading2"/>
@@ -660,49 +660,49 @@
         <w:pStyle w:val="BodyText"/>
       </w:pPr>
       <w:r>
-        <w:t xml:space="preserve">Figure 3 shows this agreement directly, rather than through a single summary number.</w:t>
-      </w:r>
-      <w:r>
-        <w:t xml:space="preserve"> </w:t>
-      </w:r>
-      <w:r>
-        <w:t xml:space="preserve">It plots the battery size recommended by the traditional engineering calculation</w:t>
-      </w:r>
-      <w:r>
-        <w:t xml:space="preserve"> </w:t>
-      </w:r>
-      <w:r>
-        <w:t xml:space="preserve">against the battery size recommended by the well-trained AI, for all 751 test</w:t>
-      </w:r>
-      <w:r>
-        <w:t xml:space="preserve"> </w:t>
-      </w:r>
-      <w:r>
-        <w:t xml:space="preserve">projects, sorted from smallest to largest. The two lines follow each other closely</w:t>
-      </w:r>
-      <w:r>
-        <w:t xml:space="preserve"> </w:t>
-      </w:r>
-      <w:r>
-        <w:t xml:space="preserve">across the entire range, from small batteries (a few hundred kilowatt-hours) to</w:t>
-      </w:r>
-      <w:r>
-        <w:t xml:space="preserve"> </w:t>
-      </w:r>
-      <w:r>
-        <w:t xml:space="preserve">large ones (nearly 9,500 kilowatt-hours) — this is the well-trained AI’s</w:t>
-      </w:r>
-      <w:r>
-        <w:t xml:space="preserve"> </w:t>
-      </w:r>
-      <w:r>
-        <w:t xml:space="preserve">recommendation tracking the engineering calculation’s answer project by project, not</w:t>
-      </w:r>
-      <w:r>
-        <w:t xml:space="preserve"> </w:t>
-      </w:r>
-      <w:r>
-        <w:t xml:space="preserve">just matching it on average.</w:t>
+        <w:t xml:space="preserve">Figure 3 shows this agreement directly, in the same style as Figure 1’s cost curve, for</w:t>
+      </w:r>
+      <w:r>
+        <w:t xml:space="preserve"> </w:t>
+      </w:r>
+      <w:r>
+        <w:t xml:space="preserve">one example project rather than a single summary number. It re-draws that same</w:t>
+      </w:r>
+      <w:r>
+        <w:t xml:space="preserve"> </w:t>
+      </w:r>
+      <w:r>
+        <w:t xml:space="preserve">U-shaped cost curve for a representative project from the test set, then marks two</w:t>
+      </w:r>
+      <w:r>
+        <w:t xml:space="preserve"> </w:t>
+      </w:r>
+      <w:r>
+        <w:t xml:space="preserve">points on it: the true lowest-cost battery size (green star) and the size the</w:t>
+      </w:r>
+      <w:r>
+        <w:t xml:space="preserve"> </w:t>
+      </w:r>
+      <w:r>
+        <w:t xml:space="preserve">well-trained AI recommended (red star). The two stars sit almost on top of each</w:t>
+      </w:r>
+      <w:r>
+        <w:t xml:space="preserve"> </w:t>
+      </w:r>
+      <w:r>
+        <w:t xml:space="preserve">other, right at the bottom of the curve — the AI’s recommendation and the true</w:t>
+      </w:r>
+      <w:r>
+        <w:t xml:space="preserve"> </w:t>
+      </w:r>
+      <w:r>
+        <w:t xml:space="preserve">optimum both land within about 250 kilowatt-hours of each other, and within half a</w:t>
+      </w:r>
+      <w:r>
+        <w:t xml:space="preserve"> </w:t>
+      </w:r>
+      <w:r>
+        <w:t xml:space="preserve">cent per kilowatt-hour of cost.</w:t>
       </w:r>
     </w:p>
     <w:p>
@@ -712,20 +712,127 @@
       <w:r>
         <w:drawing>
           <wp:inline>
-            <wp:extent cx="5334000" cy="2637356"/>
+            <wp:extent cx="5334000" cy="3303929"/>
             <wp:effectExtent b="0" l="0" r="0" t="0"/>
-            <wp:docPr descr="Battery size recommended by the traditional method vs. by the well-trained AI, across 751 test projects" title="" id="29" name="Picture"/>
+            <wp:docPr descr="System cost of electricity vs. battery size for one example project, with the true optimum and the AI’s recommendation both marked" title="" id="29" name="Picture"/>
             <a:graphic>
               <a:graphicData uri="http://schemas.openxmlformats.org/drawingml/2006/picture">
                 <pic:pic>
                   <pic:nvPicPr>
-                    <pic:cNvPr descr="../outputs/figures/30_capacity_comparison_neural_network_full.png" id="30" name="Picture"/>
+                    <pic:cNvPr descr="../outputs/figures/32_system_lcoe_curve_with_nn_prediction_full.png" id="30" name="Picture"/>
                     <pic:cNvPicPr>
                       <a:picLocks noChangeArrowheads="1" noChangeAspect="1"/>
                     </pic:cNvPicPr>
                   </pic:nvPicPr>
                   <pic:blipFill>
                     <a:blip r:embed="rId28"/>
+                    <a:stretch>
+                      <a:fillRect/>
+                    </a:stretch>
+                  </pic:blipFill>
+                  <pic:spPr bwMode="auto">
+                    <a:xfrm>
+                      <a:off x="0" y="0"/>
+                      <a:ext cx="5334000" cy="3303929"/>
+                    </a:xfrm>
+                    <a:prstGeom prst="rect">
+                      <a:avLst/>
+                    </a:prstGeom>
+                    <a:noFill/>
+                    <a:ln w="9525">
+                      <a:noFill/>
+                      <a:headEnd/>
+                      <a:tailEnd/>
+                    </a:ln>
+                  </pic:spPr>
+                </pic:pic>
+              </a:graphicData>
+            </a:graphic>
+          </wp:inline>
+        </w:drawing>
+      </w:r>
+      <w:r>
+        <w:t xml:space="preserve"> </w:t>
+      </w:r>
+      <w:r>
+        <w:rPr>
+          <w:iCs/>
+          <w:i/>
+        </w:rPr>
+        <w:t xml:space="preserve">Figure 3 — Cost curve for one representative test project, with the true lowest-cost battery size (green star) and the AI’s recommended size (red star) marked. The two stars sit almost on top of each other at the bottom of the curve.</w:t>
+      </w:r>
+    </w:p>
+    <w:p>
+      <w:pPr>
+        <w:pStyle w:val="BodyText"/>
+      </w:pPr>
+      <w:r>
+        <w:t xml:space="preserve">For a broader check across all 751 test projects at once (not just the one shown in</w:t>
+      </w:r>
+      <w:r>
+        <w:t xml:space="preserve"> </w:t>
+      </w:r>
+      <w:r>
+        <w:t xml:space="preserve">Figure 3), Figure 4 plots the battery size recommended by the traditional engineering</w:t>
+      </w:r>
+      <w:r>
+        <w:t xml:space="preserve"> </w:t>
+      </w:r>
+      <w:r>
+        <w:t xml:space="preserve">calculation against the battery size recommended by the well-trained AI, sorted from</w:t>
+      </w:r>
+      <w:r>
+        <w:t xml:space="preserve"> </w:t>
+      </w:r>
+      <w:r>
+        <w:t xml:space="preserve">smallest to largest project. The two lines follow each other closely across the</w:t>
+      </w:r>
+      <w:r>
+        <w:t xml:space="preserve"> </w:t>
+      </w:r>
+      <w:r>
+        <w:t xml:space="preserve">entire range, from small batteries (a few hundred kilowatt-hours) to large ones</w:t>
+      </w:r>
+      <w:r>
+        <w:t xml:space="preserve"> </w:t>
+      </w:r>
+      <w:r>
+        <w:t xml:space="preserve">(nearly 9,500 kilowatt-hours) — this is the well-trained AI’s recommendation tracking</w:t>
+      </w:r>
+      <w:r>
+        <w:t xml:space="preserve"> </w:t>
+      </w:r>
+      <w:r>
+        <w:t xml:space="preserve">the engineering calculation’s answer project by project, not just matching it on</w:t>
+      </w:r>
+      <w:r>
+        <w:t xml:space="preserve"> </w:t>
+      </w:r>
+      <w:r>
+        <w:t xml:space="preserve">average.</w:t>
+      </w:r>
+    </w:p>
+    <w:p>
+      <w:pPr>
+        <w:pStyle w:val="BodyText"/>
+      </w:pPr>
+      <w:r>
+        <w:drawing>
+          <wp:inline>
+            <wp:extent cx="5334000" cy="2637356"/>
+            <wp:effectExtent b="0" l="0" r="0" t="0"/>
+            <wp:docPr descr="Battery size recommended by the traditional method vs. by the well-trained AI, across 751 test projects" title="" id="32" name="Picture"/>
+            <a:graphic>
+              <a:graphicData uri="http://schemas.openxmlformats.org/drawingml/2006/picture">
+                <pic:pic>
+                  <pic:nvPicPr>
+                    <pic:cNvPr descr="../outputs/figures/30_capacity_comparison_neural_network_full.png" id="33" name="Picture"/>
+                    <pic:cNvPicPr>
+                      <a:picLocks noChangeArrowheads="1" noChangeAspect="1"/>
+                    </pic:cNvPicPr>
+                  </pic:nvPicPr>
+                  <pic:blipFill>
+                    <a:blip r:embed="rId31"/>
                     <a:stretch>
                       <a:fillRect/>
                     </a:stretch>
@@ -759,11 +866,11 @@
           <w:iCs/>
           <w:i/>
         </w:rPr>
-        <w:t xml:space="preserve">Figure 3 — Battery size recommended by the traditional engineering calculation (black) vs. the well-trained AI (blue), for 751 test projects sorted by the traditional calculation’s answer. The two lines track closely across the full range of project sizes.</w:t>
-      </w:r>
-    </w:p>
-    <w:bookmarkEnd w:id="31"/>
-    <w:bookmarkStart w:id="32" w:name="reliability-risks"/>
+        <w:t xml:space="preserve">Figure 4 — Battery size recommended by the traditional engineering calculation (black) vs. the well-trained AI (blue), for 751 test projects sorted by the traditional calculation’s answer. The two lines track closely across the full range of project sizes.</w:t>
+      </w:r>
+    </w:p>
+    <w:bookmarkEnd w:id="34"/>
+    <w:bookmarkStart w:id="35" w:name="reliability-risks"/>
     <w:p>
       <w:pPr>
         <w:pStyle w:val="Heading2"/>
@@ -892,8 +999,8 @@
         <w:t xml:space="preserve">part of the standard design.)</w:t>
       </w:r>
     </w:p>
-    <w:bookmarkEnd w:id="32"/>
-    <w:bookmarkStart w:id="36" w:name="when-ai-is-useful"/>
+    <w:bookmarkEnd w:id="35"/>
+    <w:bookmarkStart w:id="39" w:name="when-ai-is-useful"/>
     <w:p>
       <w:pPr>
         <w:pStyle w:val="Heading2"/>
@@ -907,7 +1014,7 @@
         <w:pStyle w:val="FirstParagraph"/>
       </w:pPr>
       <w:r>
-        <w:t xml:space="preserve">AI inference is dramatically faster than the full simulation (Figure 4) — a single</w:t>
+        <w:t xml:space="preserve">AI inference is dramatically faster than the full simulation (Figure 5) — a single</w:t>
       </w:r>
       <w:r>
         <w:t xml:space="preserve"> </w:t>
@@ -1013,18 +1120,18 @@
           <wp:inline>
             <wp:extent cx="5334000" cy="3297709"/>
             <wp:effectExtent b="0" l="0" r="0" t="0"/>
-            <wp:docPr descr="How long each step takes, from full simulation to AI prediction (log scale)" title="" id="34" name="Picture"/>
+            <wp:docPr descr="How long each step takes, from full simulation to AI prediction (log scale)" title="" id="37" name="Picture"/>
             <a:graphic>
               <a:graphicData uri="http://schemas.openxmlformats.org/drawingml/2006/picture">
                 <pic:pic>
                   <pic:nvPicPr>
-                    <pic:cNvPr descr="../outputs/figures/24_runtime_comparison.png" id="35" name="Picture"/>
+                    <pic:cNvPr descr="../outputs/figures/24_runtime_comparison.png" id="38" name="Picture"/>
                     <pic:cNvPicPr>
                       <a:picLocks noChangeArrowheads="1" noChangeAspect="1"/>
                     </pic:cNvPicPr>
                   </pic:nvPicPr>
                   <pic:blipFill>
-                    <a:blip r:embed="rId33"/>
+                    <a:blip r:embed="rId36"/>
                     <a:stretch>
                       <a:fillRect/>
                     </a:stretch>
@@ -1058,11 +1165,11 @@
           <w:iCs/>
           <w:i/>
         </w:rPr>
-        <w:t xml:space="preserve">Figure 4 — Time required per evaluation, from slowest (full mechanistic simulation) to fastest (AI inference) — note the scale is logarithmic, so each step down is roughly a 10x-1000x speed difference.</w:t>
-      </w:r>
-    </w:p>
-    <w:bookmarkEnd w:id="36"/>
-    <w:bookmarkStart w:id="37" w:name="Xb9b126069a4f018084d0da23d969ee6e78da413"/>
+        <w:t xml:space="preserve">Figure 5 — Time required per evaluation, from slowest (full mechanistic simulation) to fastest (AI inference) — note the scale is logarithmic, so each step down is roughly a 10x-1000x speed difference.</w:t>
+      </w:r>
+    </w:p>
+    <w:bookmarkEnd w:id="39"/>
+    <w:bookmarkStart w:id="40" w:name="Xb9b126069a4f018084d0da23d969ee6e78da413"/>
     <w:p>
       <w:pPr>
         <w:pStyle w:val="Heading2"/>
@@ -1167,8 +1274,8 @@
         <w:t xml:space="preserve">candidates are shortlisted for actual investment, before committing capital.</w:t>
       </w:r>
     </w:p>
-    <w:bookmarkEnd w:id="37"/>
-    <w:bookmarkStart w:id="38" w:name="interpretability"/>
+    <w:bookmarkEnd w:id="40"/>
+    <w:bookmarkStart w:id="41" w:name="interpretability"/>
     <w:p>
       <w:pPr>
         <w:pStyle w:val="Heading2"/>
@@ -1321,8 +1428,8 @@
         <w:t xml:space="preserve">documented, auditable justification is required, not just a number.</w:t>
       </w:r>
     </w:p>
-    <w:bookmarkEnd w:id="38"/>
-    <w:bookmarkStart w:id="39" w:name="data-requirements"/>
+    <w:bookmarkEnd w:id="41"/>
+    <w:bookmarkStart w:id="42" w:name="data-requirements"/>
     <w:p>
       <w:pPr>
         <w:pStyle w:val="Heading2"/>
@@ -1437,8 +1544,8 @@
         <w:t xml:space="preserve">a new context (new geography, new climate, new equipment class).</w:t>
       </w:r>
     </w:p>
-    <w:bookmarkEnd w:id="39"/>
-    <w:bookmarkStart w:id="40" w:name="implementation-risks"/>
+    <w:bookmarkEnd w:id="42"/>
+    <w:bookmarkStart w:id="43" w:name="implementation-risks"/>
     <w:p>
       <w:pPr>
         <w:pStyle w:val="Heading2"/>
@@ -1597,8 +1704,8 @@
         <w:t xml:space="preserve">materially different project designs without retraining.</w:t>
       </w:r>
     </w:p>
-    <w:bookmarkEnd w:id="40"/>
-    <w:bookmarkStart w:id="41" w:name="recommendations"/>
+    <w:bookmarkEnd w:id="43"/>
+    <w:bookmarkStart w:id="44" w:name="recommendations"/>
     <w:p>
       <w:pPr>
         <w:pStyle w:val="Heading2"/>
@@ -1781,8 +1888,8 @@
         <w:t xml:space="preserve">universal figures to copy into a different project.</w:t>
       </w:r>
     </w:p>
-    <w:bookmarkEnd w:id="41"/>
-    <w:bookmarkEnd w:id="42"/>
+    <w:bookmarkEnd w:id="44"/>
+    <w:bookmarkEnd w:id="45"/>
     <w:sectPr/>
   </w:body>
 </w:document>

</xml_diff>

<commit_message>
Add renewable-share dual-model chart; strengthen NN-vs-mechanistic narrative
Add plot_renewable_share_vs_lcoe_with_ai_prediction, the renewable-share
counterpart to plot_system_lcoe_curve_with_ai_prediction, so both of
Figures 27/28's chart types now have a version with the mechanistic
optimum and the neural network's prediction marked together (Figures 32
and 33). Restructure the surrounding narrative per the requested method ->
method -> dual-model results -> advantage flow: add a motivating "why a
neural network, given the mechanistic model is already exact" paragraph
up front in the NN architecture section (reproducibility/cost, not
accuracy), cross-reference Figures 27/28 forward to 32/33 and back, and
close the efficiency section by explicitly tying the ~660x speed-up to the
closeness demonstrated in Figures 32-33. Mirror the new renewable-share
comparison in decision_maker_report.md as Figure 4 (renumbering later
figures). Regenerate PDF/Word exports.
</commit_message>
<xml_diff>
--- a/reports/exports/decision_maker_report.docx
+++ b/reports/exports/decision_maker_report.docx
@@ -2,7 +2,7 @@
 <file path=word/document.xml><?xml version="1.0" encoding="utf-8"?>
 <w:document xmlns:w="http://schemas.openxmlformats.org/wordprocessingml/2006/main" xmlns:m="http://schemas.openxmlformats.org/officeDocument/2006/math" xmlns:r="http://schemas.openxmlformats.org/officeDocument/2006/relationships" xmlns:o="urn:schemas-microsoft-com:office:office" xmlns:v="urn:schemas-microsoft-com:vml" xmlns:w10="urn:schemas-microsoft-com:office:word" xmlns:a="http://schemas.openxmlformats.org/drawingml/2006/main" xmlns:pic="http://schemas.openxmlformats.org/drawingml/2006/picture" xmlns:wp="http://schemas.openxmlformats.org/drawingml/2006/wordprocessingDrawing">
   <w:body>
-    <w:bookmarkStart w:id="45" w:name="Xa7b18ad57846d4a23f20ad24ee8f3e6c977061f"/>
+    <w:bookmarkStart w:id="48" w:name="Xa7b18ad57846d4a23f20ad24ee8f3e6c977061f"/>
     <w:p>
       <w:pPr>
         <w:pStyle w:val="Heading1"/>
@@ -439,7 +439,7 @@
       </w:r>
     </w:p>
     <w:bookmarkEnd w:id="24"/>
-    <w:bookmarkStart w:id="34" w:name="cost-consequences"/>
+    <w:bookmarkStart w:id="37" w:name="cost-consequences"/>
     <w:p>
       <w:pPr>
         <w:pStyle w:val="Heading2"/>
@@ -767,49 +767,37 @@
         <w:pStyle w:val="BodyText"/>
       </w:pPr>
       <w:r>
-        <w:t xml:space="preserve">For a broader check across all 751 test projects at once (not just the one shown in</w:t>
-      </w:r>
-      <w:r>
-        <w:t xml:space="preserve"> </w:t>
-      </w:r>
-      <w:r>
-        <w:t xml:space="preserve">Figure 3), Figure 4 plots the battery size recommended by the traditional engineering</w:t>
-      </w:r>
-      <w:r>
-        <w:t xml:space="preserve"> </w:t>
-      </w:r>
-      <w:r>
-        <w:t xml:space="preserve">calculation against the battery size recommended by the well-trained AI, sorted from</w:t>
-      </w:r>
-      <w:r>
-        <w:t xml:space="preserve"> </w:t>
-      </w:r>
-      <w:r>
-        <w:t xml:space="preserve">smallest to largest project. The two lines follow each other closely across the</w:t>
-      </w:r>
-      <w:r>
-        <w:t xml:space="preserve"> </w:t>
-      </w:r>
-      <w:r>
-        <w:t xml:space="preserve">entire range, from small batteries (a few hundred kilowatt-hours) to large ones</w:t>
-      </w:r>
-      <w:r>
-        <w:t xml:space="preserve"> </w:t>
-      </w:r>
-      <w:r>
-        <w:t xml:space="preserve">(nearly 9,500 kilowatt-hours) — this is the well-trained AI’s recommendation tracking</w:t>
-      </w:r>
-      <w:r>
-        <w:t xml:space="preserve"> </w:t>
-      </w:r>
-      <w:r>
-        <w:t xml:space="preserve">the engineering calculation’s answer project by project, not just matching it on</w:t>
-      </w:r>
-      <w:r>
-        <w:t xml:space="preserve"> </w:t>
-      </w:r>
-      <w:r>
-        <w:t xml:space="preserve">average.</w:t>
+        <w:t xml:space="preserve">Figure 4 checks the same thing a second way, plotting renewable share</w:t>
+      </w:r>
+      <w:r>
+        <w:t xml:space="preserve"> </w:t>
+      </w:r>
+      <w:r>
+        <w:t xml:space="preserve">against cost instead of battery size against cost. For the same example</w:t>
+      </w:r>
+      <w:r>
+        <w:t xml:space="preserve"> </w:t>
+      </w:r>
+      <w:r>
+        <w:t xml:space="preserve">project, it marks where the true optimum and the AI’s recommendation each</w:t>
+      </w:r>
+      <w:r>
+        <w:t xml:space="preserve"> </w:t>
+      </w:r>
+      <w:r>
+        <w:t xml:space="preserve">land in terms of renewable share and cost together — again, the two stars</w:t>
+      </w:r>
+      <w:r>
+        <w:t xml:space="preserve"> </w:t>
+      </w:r>
+      <w:r>
+        <w:t xml:space="preserve">sit almost on top of each other, close to the point where adding more</w:t>
+      </w:r>
+      <w:r>
+        <w:t xml:space="preserve"> </w:t>
+      </w:r>
+      <w:r>
+        <w:t xml:space="preserve">renewable energy stops being worth its cost.</w:t>
       </w:r>
     </w:p>
     <w:p>
@@ -819,20 +807,127 @@
       <w:r>
         <w:drawing>
           <wp:inline>
-            <wp:extent cx="5334000" cy="2637356"/>
+            <wp:extent cx="5334000" cy="3980798"/>
             <wp:effectExtent b="0" l="0" r="0" t="0"/>
-            <wp:docPr descr="Battery size recommended by the traditional method vs. by the well-trained AI, across 751 test projects" title="" id="32" name="Picture"/>
+            <wp:docPr descr="Renewable share vs. cost of electricity for one example project, with the true optimum and the AI’s recommendation both marked" title="" id="32" name="Picture"/>
             <a:graphic>
               <a:graphicData uri="http://schemas.openxmlformats.org/drawingml/2006/picture">
                 <pic:pic>
                   <pic:nvPicPr>
-                    <pic:cNvPr descr="../outputs/figures/30_capacity_comparison_neural_network_full.png" id="33" name="Picture"/>
+                    <pic:cNvPr descr="../outputs/figures/33_renewable_share_vs_lcoe_with_nn_prediction_full.png" id="33" name="Picture"/>
                     <pic:cNvPicPr>
                       <a:picLocks noChangeArrowheads="1" noChangeAspect="1"/>
                     </pic:cNvPicPr>
                   </pic:nvPicPr>
                   <pic:blipFill>
                     <a:blip r:embed="rId31"/>
+                    <a:stretch>
+                      <a:fillRect/>
+                    </a:stretch>
+                  </pic:blipFill>
+                  <pic:spPr bwMode="auto">
+                    <a:xfrm>
+                      <a:off x="0" y="0"/>
+                      <a:ext cx="5334000" cy="3980798"/>
+                    </a:xfrm>
+                    <a:prstGeom prst="rect">
+                      <a:avLst/>
+                    </a:prstGeom>
+                    <a:noFill/>
+                    <a:ln w="9525">
+                      <a:noFill/>
+                      <a:headEnd/>
+                      <a:tailEnd/>
+                    </a:ln>
+                  </pic:spPr>
+                </pic:pic>
+              </a:graphicData>
+            </a:graphic>
+          </wp:inline>
+        </w:drawing>
+      </w:r>
+      <w:r>
+        <w:t xml:space="preserve"> </w:t>
+      </w:r>
+      <w:r>
+        <w:rPr>
+          <w:iCs/>
+          <w:i/>
+        </w:rPr>
+        <w:t xml:space="preserve">Figure 4 — Renewable share vs. cost of electricity for one representative test project, with the true optimum (green star) and the AI’s recommendation (red star) marked. The two stars sit almost on top of each other.</w:t>
+      </w:r>
+    </w:p>
+    <w:p>
+      <w:pPr>
+        <w:pStyle w:val="BodyText"/>
+      </w:pPr>
+      <w:r>
+        <w:t xml:space="preserve">For a broader check across all 751 test projects at once (not just the one shown in</w:t>
+      </w:r>
+      <w:r>
+        <w:t xml:space="preserve"> </w:t>
+      </w:r>
+      <w:r>
+        <w:t xml:space="preserve">Figures 3-4), Figure 5 plots the battery size recommended by the traditional engineering</w:t>
+      </w:r>
+      <w:r>
+        <w:t xml:space="preserve"> </w:t>
+      </w:r>
+      <w:r>
+        <w:t xml:space="preserve">calculation against the battery size recommended by the well-trained AI, sorted from</w:t>
+      </w:r>
+      <w:r>
+        <w:t xml:space="preserve"> </w:t>
+      </w:r>
+      <w:r>
+        <w:t xml:space="preserve">smallest to largest project. The two lines follow each other closely across the</w:t>
+      </w:r>
+      <w:r>
+        <w:t xml:space="preserve"> </w:t>
+      </w:r>
+      <w:r>
+        <w:t xml:space="preserve">entire range, from small batteries (a few hundred kilowatt-hours) to large ones</w:t>
+      </w:r>
+      <w:r>
+        <w:t xml:space="preserve"> </w:t>
+      </w:r>
+      <w:r>
+        <w:t xml:space="preserve">(nearly 9,500 kilowatt-hours) — this is the well-trained AI’s recommendation tracking</w:t>
+      </w:r>
+      <w:r>
+        <w:t xml:space="preserve"> </w:t>
+      </w:r>
+      <w:r>
+        <w:t xml:space="preserve">the engineering calculation’s answer project by project, not just matching it on</w:t>
+      </w:r>
+      <w:r>
+        <w:t xml:space="preserve"> </w:t>
+      </w:r>
+      <w:r>
+        <w:t xml:space="preserve">average.</w:t>
+      </w:r>
+    </w:p>
+    <w:p>
+      <w:pPr>
+        <w:pStyle w:val="BodyText"/>
+      </w:pPr>
+      <w:r>
+        <w:drawing>
+          <wp:inline>
+            <wp:extent cx="5334000" cy="2637356"/>
+            <wp:effectExtent b="0" l="0" r="0" t="0"/>
+            <wp:docPr descr="Battery size recommended by the traditional method vs. by the well-trained AI, across 751 test projects" title="" id="35" name="Picture"/>
+            <a:graphic>
+              <a:graphicData uri="http://schemas.openxmlformats.org/drawingml/2006/picture">
+                <pic:pic>
+                  <pic:nvPicPr>
+                    <pic:cNvPr descr="../outputs/figures/30_capacity_comparison_neural_network_full.png" id="36" name="Picture"/>
+                    <pic:cNvPicPr>
+                      <a:picLocks noChangeArrowheads="1" noChangeAspect="1"/>
+                    </pic:cNvPicPr>
+                  </pic:nvPicPr>
+                  <pic:blipFill>
+                    <a:blip r:embed="rId34"/>
                     <a:stretch>
                       <a:fillRect/>
                     </a:stretch>
@@ -866,11 +961,11 @@
           <w:iCs/>
           <w:i/>
         </w:rPr>
-        <w:t xml:space="preserve">Figure 4 — Battery size recommended by the traditional engineering calculation (black) vs. the well-trained AI (blue), for 751 test projects sorted by the traditional calculation’s answer. The two lines track closely across the full range of project sizes.</w:t>
-      </w:r>
-    </w:p>
-    <w:bookmarkEnd w:id="34"/>
-    <w:bookmarkStart w:id="35" w:name="reliability-risks"/>
+        <w:t xml:space="preserve">Figure 5 — Battery size recommended by the traditional engineering calculation (black) vs. the well-trained AI (blue), for 751 test projects sorted by the traditional calculation’s answer. The two lines track closely across the full range of project sizes.</w:t>
+      </w:r>
+    </w:p>
+    <w:bookmarkEnd w:id="37"/>
+    <w:bookmarkStart w:id="38" w:name="reliability-risks"/>
     <w:p>
       <w:pPr>
         <w:pStyle w:val="Heading2"/>
@@ -999,8 +1094,8 @@
         <w:t xml:space="preserve">part of the standard design.)</w:t>
       </w:r>
     </w:p>
-    <w:bookmarkEnd w:id="35"/>
-    <w:bookmarkStart w:id="39" w:name="when-ai-is-useful"/>
+    <w:bookmarkEnd w:id="38"/>
+    <w:bookmarkStart w:id="42" w:name="when-ai-is-useful"/>
     <w:p>
       <w:pPr>
         <w:pStyle w:val="Heading2"/>
@@ -1014,7 +1109,7 @@
         <w:pStyle w:val="FirstParagraph"/>
       </w:pPr>
       <w:r>
-        <w:t xml:space="preserve">AI inference is dramatically faster than the full simulation (Figure 5) — a single</w:t>
+        <w:t xml:space="preserve">AI inference is dramatically faster than the full simulation (Figure 6) — a single</w:t>
       </w:r>
       <w:r>
         <w:t xml:space="preserve"> </w:t>
@@ -1120,18 +1215,18 @@
           <wp:inline>
             <wp:extent cx="5334000" cy="3297709"/>
             <wp:effectExtent b="0" l="0" r="0" t="0"/>
-            <wp:docPr descr="How long each step takes, from full simulation to AI prediction (log scale)" title="" id="37" name="Picture"/>
+            <wp:docPr descr="How long each step takes, from full simulation to AI prediction (log scale)" title="" id="40" name="Picture"/>
             <a:graphic>
               <a:graphicData uri="http://schemas.openxmlformats.org/drawingml/2006/picture">
                 <pic:pic>
                   <pic:nvPicPr>
-                    <pic:cNvPr descr="../outputs/figures/24_runtime_comparison.png" id="38" name="Picture"/>
+                    <pic:cNvPr descr="../outputs/figures/24_runtime_comparison.png" id="41" name="Picture"/>
                     <pic:cNvPicPr>
                       <a:picLocks noChangeArrowheads="1" noChangeAspect="1"/>
                     </pic:cNvPicPr>
                   </pic:nvPicPr>
                   <pic:blipFill>
-                    <a:blip r:embed="rId36"/>
+                    <a:blip r:embed="rId39"/>
                     <a:stretch>
                       <a:fillRect/>
                     </a:stretch>
@@ -1165,11 +1260,11 @@
           <w:iCs/>
           <w:i/>
         </w:rPr>
-        <w:t xml:space="preserve">Figure 5 — Time required per evaluation, from slowest (full mechanistic simulation) to fastest (AI inference) — note the scale is logarithmic, so each step down is roughly a 10x-1000x speed difference.</w:t>
-      </w:r>
-    </w:p>
-    <w:bookmarkEnd w:id="39"/>
-    <w:bookmarkStart w:id="40" w:name="Xb9b126069a4f018084d0da23d969ee6e78da413"/>
+        <w:t xml:space="preserve">Figure 6 — Time required per evaluation, from slowest (full mechanistic simulation) to fastest (AI inference) — note the scale is logarithmic, so each step down is roughly a 10x-1000x speed difference.</w:t>
+      </w:r>
+    </w:p>
+    <w:bookmarkEnd w:id="42"/>
+    <w:bookmarkStart w:id="43" w:name="Xb9b126069a4f018084d0da23d969ee6e78da413"/>
     <w:p>
       <w:pPr>
         <w:pStyle w:val="Heading2"/>
@@ -1274,8 +1369,8 @@
         <w:t xml:space="preserve">candidates are shortlisted for actual investment, before committing capital.</w:t>
       </w:r>
     </w:p>
-    <w:bookmarkEnd w:id="40"/>
-    <w:bookmarkStart w:id="41" w:name="interpretability"/>
+    <w:bookmarkEnd w:id="43"/>
+    <w:bookmarkStart w:id="44" w:name="interpretability"/>
     <w:p>
       <w:pPr>
         <w:pStyle w:val="Heading2"/>
@@ -1428,8 +1523,8 @@
         <w:t xml:space="preserve">documented, auditable justification is required, not just a number.</w:t>
       </w:r>
     </w:p>
-    <w:bookmarkEnd w:id="41"/>
-    <w:bookmarkStart w:id="42" w:name="data-requirements"/>
+    <w:bookmarkEnd w:id="44"/>
+    <w:bookmarkStart w:id="45" w:name="data-requirements"/>
     <w:p>
       <w:pPr>
         <w:pStyle w:val="Heading2"/>
@@ -1544,8 +1639,8 @@
         <w:t xml:space="preserve">a new context (new geography, new climate, new equipment class).</w:t>
       </w:r>
     </w:p>
-    <w:bookmarkEnd w:id="42"/>
-    <w:bookmarkStart w:id="43" w:name="implementation-risks"/>
+    <w:bookmarkEnd w:id="45"/>
+    <w:bookmarkStart w:id="46" w:name="implementation-risks"/>
     <w:p>
       <w:pPr>
         <w:pStyle w:val="Heading2"/>
@@ -1704,8 +1799,8 @@
         <w:t xml:space="preserve">materially different project designs without retraining.</w:t>
       </w:r>
     </w:p>
-    <w:bookmarkEnd w:id="43"/>
-    <w:bookmarkStart w:id="44" w:name="recommendations"/>
+    <w:bookmarkEnd w:id="46"/>
+    <w:bookmarkStart w:id="47" w:name="recommendations"/>
     <w:p>
       <w:pPr>
         <w:pStyle w:val="Heading2"/>
@@ -1888,8 +1983,8 @@
         <w:t xml:space="preserve">universal figures to copy into a different project.</w:t>
       </w:r>
     </w:p>
-    <w:bookmarkEnd w:id="44"/>
-    <w:bookmarkEnd w:id="45"/>
+    <w:bookmarkEnd w:id="47"/>
+    <w:bookmarkEnd w:id="48"/>
     <w:sectPr/>
   </w:body>
 </w:document>

</xml_diff>